<commit_message>
Restructure VAT code table: code, description, when applies, exceptions
Co-Authored-By: Claude Sonnet 5.5 <noreply@anthropic.com>
Claude-Session: https://claude.ai/code/session_01HwouEZMchCnSFLcjGwnegZ
</commit_message>
<xml_diff>
--- a/out/AP1311_Resumen_tax_codes_IVA_BE.docx
+++ b/out/AP1311_Resumen_tax_codes_IVA_BE.docx
@@ -14,7 +14,7 @@
     </w:p>
     <w:p>
       <w:r>
-        <w:t xml:space="preserve">DS Smith Packaging Belgium NV (DSSPB) y DS Smith Packaging Marketing NV (DSSPM). Resumen del manual AP1311. Orden de consulta: 1) ¿de dónde es el proveedor? 2) ¿bienes o servicios? 3) ¿qué % de IVA aparece? </w:t>
+        <w:t>DS Smith Packaging Belgium NV (DSSPB) y DS Smith Packaging Marketing NV (DSSPM). Resumen del manual AP1311. Orden de consulta: 1) origen del proveedor, 2) bienes o servicios, 3) % de IVA. Los artículos de ley son los citados en el manual.</w:t>
       </w:r>
     </w:p>
     <w:tbl>
@@ -55,7 +55,7 @@
         </w:tc>
         <w:tc>
           <w:tcPr>
-            <w:tcW w:type="dxa" w:w="4649"/>
+            <w:tcW w:type="dxa" w:w="3515"/>
             <w:shd w:val="clear" w:fill="1F3A5F"/>
           </w:tcPr>
           <w:p>
@@ -68,13 +68,13 @@
                 <w:b/>
                 <w:color w:val="FFFFFF"/>
               </w:rPr>
-              <w:t>Cuándo usarlo</w:t>
+              <w:t>Descripción</w:t>
             </w:r>
           </w:p>
         </w:tc>
         <w:tc>
           <w:tcPr>
-            <w:tcW w:type="dxa" w:w="4876"/>
+            <w:tcW w:type="dxa" w:w="5783"/>
             <w:shd w:val="clear" w:fill="1F3A5F"/>
           </w:tcPr>
           <w:p>
@@ -87,13 +87,13 @@
                 <w:b/>
                 <w:color w:val="FFFFFF"/>
               </w:rPr>
-              <w:t>Cómo identificarlo en la factura</w:t>
+              <w:t>Cuándo aplica</w:t>
             </w:r>
           </w:p>
         </w:tc>
         <w:tc>
           <w:tcPr>
-            <w:tcW w:type="dxa" w:w="4309"/>
+            <w:tcW w:type="dxa" w:w="4535"/>
             <w:shd w:val="clear" w:fill="1F3A5F"/>
           </w:tcPr>
           <w:p>
@@ -106,7 +106,7 @@
                 <w:b/>
                 <w:color w:val="FFFFFF"/>
               </w:rPr>
-              <w:t>Atención / excepciones</w:t>
+              <w:t>Excepciones</w:t>
             </w:r>
           </w:p>
         </w:tc>
@@ -114,9 +114,8 @@
       <w:tr>
         <w:tc>
           <w:tcPr>
-            <w:tcW w:type="dxa" w:w="15364"/>
-            <w:gridSpan w:val="4"/>
-            <w:shd w:val="clear" w:fill="DCE6F1"/>
+            <w:tcW w:type="dxa" w:w="1134"/>
+            <w:shd w:val="clear" w:fill="F2F2F2"/>
           </w:tcPr>
           <w:p>
             <w:pPr>
@@ -126,9 +125,81 @@
             <w:r>
               <w:rPr>
                 <w:b/>
-                <w:color w:val="1F3A5F"/>
               </w:rPr>
-              <w:t>1. PROVEEDOR BELGA (con IVA belga)</w:t>
+              <w:t>Q0</w:t>
+            </w:r>
+          </w:p>
+        </w:tc>
+        <w:tc>
+          <w:tcPr>
+            <w:tcW w:type="dxa" w:w="3515"/>
+          </w:tcPr>
+          <w:p>
+            <w:pPr>
+              <w:spacing w:after="0"/>
+            </w:pPr>
+            <w:r/>
+            <w:r>
+              <w:rPr>
+                <w:b w:val="0"/>
+              </w:rPr>
+              <w:t>0 % / IVA no deducible (proveedor BE). Entra en la declaración de IVA.</w:t>
+            </w:r>
+          </w:p>
+        </w:tc>
+        <w:tc>
+          <w:tcPr>
+            <w:tcW w:type="dxa" w:w="5783"/>
+          </w:tcPr>
+          <w:p>
+            <w:pPr>
+              <w:spacing w:after="0"/>
+            </w:pPr>
+            <w:r/>
+            <w:r>
+              <w:rPr>
+                <w:b w:val="0"/>
+              </w:rPr>
+              <w:t>Factura belga sin IVA o con IVA no deducible: vales de comida (Edenred), alquiler de edificios, seguros (incl. coches), extractos de tarjeta no BE (Barclays, Airplus), transporte 0 %, embalaje extra, leasing de bicicletas (O2O 1000029004), flores/regalos (Van Cauwenberge 1000016602, VDC Komerz 1000031901), restaurante (RSCA 1000016823).</w:t>
+            </w:r>
+          </w:p>
+          <w:p>
+            <w:pPr>
+              <w:spacing w:after="0"/>
+            </w:pPr>
+            <w:r>
+              <w:rPr>
+                <w:b w:val="0"/>
+              </w:rPr>
+              <w:t>Importación de bienes de fuera de la UE con documentos de aduana (p. ej. Simpson/Dawes, Ossett GB 1000030093): el SSC hace la autoliquidación manual con los documentos del broker (Mainfreight).</w:t>
+            </w:r>
+          </w:p>
+        </w:tc>
+        <w:tc>
+          <w:tcPr>
+            <w:tcW w:type="dxa" w:w="4535"/>
+          </w:tcPr>
+          <w:p>
+            <w:pPr>
+              <w:spacing w:after="0"/>
+            </w:pPr>
+            <w:r/>
+            <w:r>
+              <w:rPr>
+                <w:b w:val="0"/>
+              </w:rPr>
+              <w:t>Aunque la factura muestre 21 % o 6 %, estos proveedores van a Q0 (manda la SAP Tax Table; en Verify el campo IVA no está activo).</w:t>
+            </w:r>
+          </w:p>
+          <w:p>
+            <w:pPr>
+              <w:spacing w:after="0"/>
+            </w:pPr>
+            <w:r>
+              <w:rPr>
+                <w:b w:val="0"/>
+              </w:rPr>
+              <w:t>No confundir con Q3: Q0 sí entra en la declaración.</w:t>
             </w:r>
           </w:p>
         </w:tc>
@@ -154,7 +225,7 @@
         </w:tc>
         <w:tc>
           <w:tcPr>
-            <w:tcW w:type="dxa" w:w="4649"/>
+            <w:tcW w:type="dxa" w:w="3515"/>
           </w:tcPr>
           <w:p>
             <w:pPr>
@@ -165,13 +236,13 @@
               <w:rPr>
                 <w:b w:val="0"/>
               </w:rPr>
-              <w:t>Bienes (commodities) con 21%.</w:t>
+              <w:t>21 % bienes (commodities).</w:t>
             </w:r>
           </w:p>
         </w:tc>
         <w:tc>
           <w:tcPr>
-            <w:tcW w:type="dxa" w:w="4876"/>
+            <w:tcW w:type="dxa" w:w="5783"/>
           </w:tcPr>
           <w:p>
             <w:pPr>
@@ -182,13 +253,13 @@
               <w:rPr>
                 <w:b w:val="0"/>
               </w:rPr>
-              <w:t>Proveedor BE, 21%. PO que empieza por 100… (YSOS) o contrato marco 55…: casi siempre commodity.</w:t>
+              <w:t>Proveedor BE con 21 % que vende commodities. PO 100… (YSOS) o contrato marco 55…: casi siempre Q1.</w:t>
             </w:r>
           </w:p>
         </w:tc>
         <w:tc>
           <w:tcPr>
-            <w:tcW w:type="dxa" w:w="4309"/>
+            <w:tcW w:type="dxa" w:w="4535"/>
           </w:tcPr>
           <w:p>
             <w:pPr>
@@ -210,7 +281,7 @@
               <w:rPr>
                 <w:b w:val="0"/>
               </w:rPr>
-              <w:t>PO SAP 45…: manda la SAP Tax Table del proveedor; confirmar en el texto si es bien o servicio.</w:t>
+              <w:t>PO SAP 45…: manda la SAP Tax Table; confirmar en el texto si es bien o servicio.</w:t>
             </w:r>
           </w:p>
         </w:tc>
@@ -230,13 +301,13 @@
               <w:rPr>
                 <w:b/>
               </w:rPr>
-              <w:t>QK</w:t>
+              <w:t>Q2</w:t>
             </w:r>
           </w:p>
         </w:tc>
         <w:tc>
           <w:tcPr>
-            <w:tcW w:type="dxa" w:w="4649"/>
+            <w:tcW w:type="dxa" w:w="3515"/>
           </w:tcPr>
           <w:p>
             <w:pPr>
@@ -247,13 +318,13 @@
               <w:rPr>
                 <w:b w:val="0"/>
               </w:rPr>
-              <w:t>Servicios y bienes diversos con 21%.</w:t>
+              <w:t>Importación de bienes: IVA de importación a pagar.</w:t>
             </w:r>
           </w:p>
         </w:tc>
         <w:tc>
           <w:tcPr>
-            <w:tcW w:type="dxa" w:w="4876"/>
+            <w:tcW w:type="dxa" w:w="5783"/>
           </w:tcPr>
           <w:p>
             <w:pPr>
@@ -264,13 +335,13 @@
               <w:rPr>
                 <w:b w:val="0"/>
               </w:rPr>
-              <w:t>Proveedor BE, 21%. PO Coupa 3000…: siempre servicios/bienes diversos.</w:t>
+              <w:t>Compra de bienes fuera de la UE declarada vía aduana (el valor lo fija aduana).</w:t>
             </w:r>
           </w:p>
         </w:tc>
         <w:tc>
           <w:tcPr>
-            <w:tcW w:type="dxa" w:w="4309"/>
+            <w:tcW w:type="dxa" w:w="4535"/>
           </w:tcPr>
           <w:p>
             <w:pPr>
@@ -281,182 +352,7 @@
               <w:rPr>
                 <w:b w:val="0"/>
               </w:rPr>
-              <w:t>Único código de 21% en DSSPM.</w:t>
-            </w:r>
-          </w:p>
-          <w:p>
-            <w:pPr>
-              <w:spacing w:after="0"/>
-            </w:pPr>
-            <w:r>
-              <w:rPr>
-                <w:b w:val="0"/>
-              </w:rPr>
-              <w:t>Telefonía fija e internet de Proximus: QK.</w:t>
-            </w:r>
-          </w:p>
-        </w:tc>
-      </w:tr>
-      <w:tr>
-        <w:tc>
-          <w:tcPr>
-            <w:tcW w:type="dxa" w:w="1134"/>
-            <w:shd w:val="clear" w:fill="F2F2F2"/>
-          </w:tcPr>
-          <w:p>
-            <w:pPr>
-              <w:spacing w:after="0"/>
-            </w:pPr>
-            <w:r/>
-            <w:r>
-              <w:rPr>
-                <w:b/>
-              </w:rPr>
-              <w:t>QM</w:t>
-            </w:r>
-          </w:p>
-        </w:tc>
-        <w:tc>
-          <w:tcPr>
-            <w:tcW w:type="dxa" w:w="4649"/>
-          </w:tcPr>
-          <w:p>
-            <w:pPr>
-              <w:spacing w:after="0"/>
-            </w:pPr>
-            <w:r/>
-            <w:r>
-              <w:rPr>
-                <w:b w:val="0"/>
-              </w:rPr>
-              <w:t>6%: servicios y bienes diversos.</w:t>
-            </w:r>
-          </w:p>
-        </w:tc>
-        <w:tc>
-          <w:tcPr>
-            <w:tcW w:type="dxa" w:w="4876"/>
-          </w:tcPr>
-          <w:p>
-            <w:pPr>
-              <w:spacing w:after="0"/>
-            </w:pPr>
-            <w:r/>
-            <w:r>
-              <w:rPr>
-                <w:b w:val="0"/>
-              </w:rPr>
-              <w:t>Agua de red (De Watergroep 1000016615, TMVW 1000016594), taxi, agua potable/refrescos/fruta, medicamentos, periódicos y libros.</w:t>
-            </w:r>
-          </w:p>
-        </w:tc>
-        <w:tc>
-          <w:tcPr>
-            <w:tcW w:type="dxa" w:w="4309"/>
-          </w:tcPr>
-          <w:p>
-            <w:pPr>
-              <w:spacing w:after="0"/>
-            </w:pPr>
-            <w:r/>
-            <w:r>
-              <w:rPr>
-                <w:b w:val="0"/>
-              </w:rPr>
-              <w:t>Q8 (6% commodities) no se usa en las sociedades belgas.</w:t>
-            </w:r>
-          </w:p>
-        </w:tc>
-      </w:tr>
-      <w:tr>
-        <w:tc>
-          <w:tcPr>
-            <w:tcW w:type="dxa" w:w="1134"/>
-            <w:shd w:val="clear" w:fill="F2F2F2"/>
-          </w:tcPr>
-          <w:p>
-            <w:pPr>
-              <w:spacing w:after="0"/>
-            </w:pPr>
-            <w:r/>
-            <w:r>
-              <w:rPr>
-                <w:b/>
-              </w:rPr>
-              <w:t>Q0</w:t>
-            </w:r>
-          </w:p>
-        </w:tc>
-        <w:tc>
-          <w:tcPr>
-            <w:tcW w:type="dxa" w:w="4649"/>
-          </w:tcPr>
-          <w:p>
-            <w:pPr>
-              <w:spacing w:after="0"/>
-            </w:pPr>
-            <w:r/>
-            <w:r>
-              <w:rPr>
-                <w:b w:val="0"/>
-              </w:rPr>
-              <w:t>0% o IVA no deducible. Entra en la declaración de IVA.</w:t>
-            </w:r>
-          </w:p>
-        </w:tc>
-        <w:tc>
-          <w:tcPr>
-            <w:tcW w:type="dxa" w:w="4876"/>
-          </w:tcPr>
-          <w:p>
-            <w:pPr>
-              <w:spacing w:after="0"/>
-            </w:pPr>
-            <w:r/>
-            <w:r>
-              <w:rPr>
-                <w:b w:val="0"/>
-              </w:rPr>
-              <w:t>Factura sin IVA (0%), o con IVA no deducible: vales de comida (Edenred), alquiler de edificios, seguros (incl. coches), extractos de tarjeta no BE (Barclays, Airplus), transporte 0%, embalaje extra.</w:t>
-            </w:r>
-          </w:p>
-          <w:p>
-            <w:pPr>
-              <w:spacing w:after="0"/>
-            </w:pPr>
-            <w:r>
-              <w:rPr>
-                <w:b w:val="0"/>
-              </w:rPr>
-              <w:t>No deducible: leasing bicicletas (O2O 1000029004), flores/regalos (Van Cauwenberge 1000016602, VDC Komerz 1000031901), restaurante (RSCA 1000016823).</w:t>
-            </w:r>
-          </w:p>
-        </w:tc>
-        <w:tc>
-          <w:tcPr>
-            <w:tcW w:type="dxa" w:w="4309"/>
-          </w:tcPr>
-          <w:p>
-            <w:pPr>
-              <w:spacing w:after="0"/>
-            </w:pPr>
-            <w:r/>
-            <w:r>
-              <w:rPr>
-                <w:b w:val="0"/>
-              </w:rPr>
-              <w:t>Aunque la factura muestre 21% o 6%, estos proveedores se contabilizan con Q0 (los define la SAP Tax Table; en Verify el campo IVA no está activo).</w:t>
-            </w:r>
-          </w:p>
-          <w:p>
-            <w:pPr>
-              <w:spacing w:after="0"/>
-            </w:pPr>
-            <w:r>
-              <w:rPr>
-                <w:b w:val="0"/>
-              </w:rPr>
-              <w:t>12% (restaurante/catering): nunca deducible. Q7 y QL no se usan (ver nota abajo).</w:t>
+              <w:t>NO se puede usar en ninguna factura. Estas facturas van con Q0.</w:t>
             </w:r>
           </w:p>
         </w:tc>
@@ -482,7 +378,7 @@
         </w:tc>
         <w:tc>
           <w:tcPr>
-            <w:tcW w:type="dxa" w:w="4649"/>
+            <w:tcW w:type="dxa" w:w="3515"/>
           </w:tcPr>
           <w:p>
             <w:pPr>
@@ -493,13 +389,13 @@
               <w:rPr>
                 <w:b w:val="0"/>
               </w:rPr>
-              <w:t>Fuera del ámbito del IVA. NO entra en la declaración.</w:t>
+              <w:t>Fuera del ámbito del IVA (sin %, sin efecto en la declaración).</w:t>
             </w:r>
           </w:p>
         </w:tc>
         <w:tc>
           <w:tcPr>
-            <w:tcW w:type="dxa" w:w="4876"/>
+            <w:tcW w:type="dxa" w:w="5783"/>
           </w:tcPr>
           <w:p>
             <w:pPr>
@@ -510,13 +406,13 @@
               <w:rPr>
                 <w:b w:val="0"/>
               </w:rPr>
-              <w:t>Cargos sociales (SD Worx) e impuestos. Facturas de SD Worx: separar parte administrativa (IVA BE) de cargos sociales (Q3).</w:t>
+              <w:t>Cargos sociales (SD Worx) e impuestos. En facturas de SD Worx: parte administrativa con IVA BE y cargos sociales con Q3.</w:t>
             </w:r>
           </w:p>
         </w:tc>
         <w:tc>
           <w:tcPr>
-            <w:tcW w:type="dxa" w:w="4309"/>
+            <w:tcW w:type="dxa" w:w="4535"/>
           </w:tcPr>
           <w:p>
             <w:pPr>
@@ -547,13 +443,13 @@
               <w:rPr>
                 <w:b/>
               </w:rPr>
-              <w:t>QI</w:t>
+              <w:t>Q4</w:t>
             </w:r>
           </w:p>
         </w:tc>
         <w:tc>
           <w:tcPr>
-            <w:tcW w:type="dxa" w:w="4649"/>
+            <w:tcW w:type="dxa" w:w="3515"/>
           </w:tcPr>
           <w:p>
             <w:pPr>
@@ -564,13 +460,13 @@
               <w:rPr>
                 <w:b w:val="0"/>
               </w:rPr>
-              <w:t>Leasing y gastos de coches de empresa con 21%: solo 35% deducible.</w:t>
+              <w:t>0 % bienes UE: autoliquidación (adquisición intracomunitaria).</w:t>
             </w:r>
           </w:p>
         </w:tc>
         <w:tc>
           <w:tcPr>
-            <w:tcW w:type="dxa" w:w="4876"/>
+            <w:tcW w:type="dxa" w:w="5783"/>
           </w:tcPr>
           <w:p>
             <w:pPr>
@@ -581,13 +477,1040 @@
               <w:rPr>
                 <w:b w:val="0"/>
               </w:rPr>
-              <w:t>Facturas de KBC Autolease 1000003080, Alphabet 1000016478, AXUS/ALD 1000002716, Arval 1000027841. También mantenimiento y combustible del coche.</w:t>
+              <w:t>Proveedor con NIF-IVA de otro estado UE (no BE); transporte a otro estado miembro por proveedor o cliente. Directive 2006/112/EC (entrega intracomunitaria exenta). Textos: "Intracommunautaire levering", "Intra-community delivery", "Livraison intracommunautaire exonérée de TVA", códigos de mercancía, peso, Incoterms.</w:t>
             </w:r>
           </w:p>
         </w:tc>
         <w:tc>
           <w:tcPr>
-            <w:tcW w:type="dxa" w:w="4309"/>
+            <w:tcW w:type="dxa" w:w="4535"/>
+          </w:tcPr>
+          <w:p>
+            <w:pPr>
+              <w:spacing w:after="0"/>
+            </w:pPr>
+            <w:r/>
+            <w:r>
+              <w:rPr>
+                <w:b w:val="0"/>
+              </w:rPr>
+              <w:t>Vale para todos los bienes (no se separa commodity/diverso).</w:t>
+            </w:r>
+          </w:p>
+          <w:p>
+            <w:pPr>
+              <w:spacing w:after="0"/>
+            </w:pPr>
+            <w:r>
+              <w:rPr>
+                <w:b w:val="0"/>
+              </w:rPr>
+              <w:t>Un mismo proveedor puede vender bienes y servicios (Q4 y Q5).</w:t>
+            </w:r>
+          </w:p>
+        </w:tc>
+      </w:tr>
+      <w:tr>
+        <w:tc>
+          <w:tcPr>
+            <w:tcW w:type="dxa" w:w="1134"/>
+            <w:shd w:val="clear" w:fill="F2F2F2"/>
+          </w:tcPr>
+          <w:p>
+            <w:pPr>
+              <w:spacing w:after="0"/>
+            </w:pPr>
+            <w:r/>
+            <w:r>
+              <w:rPr>
+                <w:b/>
+              </w:rPr>
+              <w:t>Q5</w:t>
+            </w:r>
+          </w:p>
+        </w:tc>
+        <w:tc>
+          <w:tcPr>
+            <w:tcW w:type="dxa" w:w="3515"/>
+          </w:tcPr>
+          <w:p>
+            <w:pPr>
+              <w:spacing w:after="0"/>
+            </w:pPr>
+            <w:r/>
+            <w:r>
+              <w:rPr>
+                <w:b w:val="0"/>
+              </w:rPr>
+              <w:t>0 % servicios UE: autoliquidación.</w:t>
+            </w:r>
+          </w:p>
+        </w:tc>
+        <w:tc>
+          <w:tcPr>
+            <w:tcW w:type="dxa" w:w="5783"/>
+          </w:tcPr>
+          <w:p>
+            <w:pPr>
+              <w:spacing w:after="0"/>
+            </w:pPr>
+            <w:r/>
+            <w:r>
+              <w:rPr>
+                <w:b w:val="0"/>
+              </w:rPr>
+              <w:t>Servicio de proveedor UE sin IVA. Art. 44 Directiva IVA: el servicio tributa en Bélgica. Típicos: transporte, mantenimiento/consultoría IT, recharges intercompany, alquileres, comisiones, mantenimiento.</w:t>
+            </w:r>
+          </w:p>
+        </w:tc>
+        <w:tc>
+          <w:tcPr>
+            <w:tcW w:type="dxa" w:w="4535"/>
+          </w:tcPr>
+          <w:p>
+            <w:pPr>
+              <w:spacing w:after="0"/>
+            </w:pPr>
+            <w:r/>
+            <w:r>
+              <w:rPr>
+                <w:b w:val="0"/>
+              </w:rPr>
+              <w:t>Con IVA local extranjero (no autoliquidar): formación en otro país UE y restaurantes locales.</w:t>
+            </w:r>
+          </w:p>
+          <w:p>
+            <w:pPr>
+              <w:spacing w:after="0"/>
+            </w:pPr>
+            <w:r>
+              <w:rPr>
+                <w:b w:val="0"/>
+              </w:rPr>
+              <w:t>DSSPM: consultoría con IVA extranjero es incorrecto; pedir nueva factura con autoliquidación.</w:t>
+            </w:r>
+          </w:p>
+          <w:p>
+            <w:pPr>
+              <w:spacing w:after="0"/>
+            </w:pPr>
+            <w:r>
+              <w:rPr>
+                <w:b w:val="0"/>
+              </w:rPr>
+              <w:t>Obras en inmuebles/instalaciones: ver QN.</w:t>
+            </w:r>
+          </w:p>
+        </w:tc>
+      </w:tr>
+      <w:tr>
+        <w:tc>
+          <w:tcPr>
+            <w:tcW w:type="dxa" w:w="1134"/>
+            <w:shd w:val="clear" w:fill="F2F2F2"/>
+          </w:tcPr>
+          <w:p>
+            <w:pPr>
+              <w:spacing w:after="0"/>
+            </w:pPr>
+            <w:r/>
+            <w:r>
+              <w:rPr>
+                <w:b/>
+              </w:rPr>
+              <w:t>Q6</w:t>
+            </w:r>
+          </w:p>
+        </w:tc>
+        <w:tc>
+          <w:tcPr>
+            <w:tcW w:type="dxa" w:w="3515"/>
+          </w:tcPr>
+          <w:p>
+            <w:pPr>
+              <w:spacing w:after="0"/>
+            </w:pPr>
+            <w:r/>
+            <w:r>
+              <w:rPr>
+                <w:b w:val="0"/>
+              </w:rPr>
+              <w:t>0 % servicios fuera de UE: autoliquidación (importación de servicios).</w:t>
+            </w:r>
+          </w:p>
+        </w:tc>
+        <w:tc>
+          <w:tcPr>
+            <w:tcW w:type="dxa" w:w="5783"/>
+          </w:tcPr>
+          <w:p>
+            <w:pPr>
+              <w:spacing w:after="0"/>
+            </w:pPr>
+            <w:r/>
+            <w:r>
+              <w:rPr>
+                <w:b w:val="0"/>
+              </w:rPr>
+              <w:t>Proveedor de país no UE (CH, GB, TR…), normalmente sin IVA o con 0 %. Todo recharge de DS Smith UK (GB fuera de la UE desde 01/01/2021).</w:t>
+            </w:r>
+          </w:p>
+        </w:tc>
+        <w:tc>
+          <w:tcPr>
+            <w:tcW w:type="dxa" w:w="4535"/>
+          </w:tcPr>
+          <w:p>
+            <w:pPr>
+              <w:spacing w:after="0"/>
+            </w:pPr>
+            <w:r/>
+            <w:r>
+              <w:rPr>
+                <w:b w:val="0"/>
+              </w:rPr>
+              <w:t>Usar Q6, no Q5. Revisar el NIF-IVA y qué se entrega.</w:t>
+            </w:r>
+          </w:p>
+        </w:tc>
+      </w:tr>
+      <w:tr>
+        <w:tc>
+          <w:tcPr>
+            <w:tcW w:type="dxa" w:w="1134"/>
+            <w:shd w:val="clear" w:fill="F2F2F2"/>
+          </w:tcPr>
+          <w:p>
+            <w:pPr>
+              <w:spacing w:after="0"/>
+            </w:pPr>
+            <w:r/>
+            <w:r>
+              <w:rPr>
+                <w:b/>
+              </w:rPr>
+              <w:t>Q7</w:t>
+            </w:r>
+          </w:p>
+        </w:tc>
+        <w:tc>
+          <w:tcPr>
+            <w:tcW w:type="dxa" w:w="3515"/>
+          </w:tcPr>
+          <w:p>
+            <w:pPr>
+              <w:spacing w:after="0"/>
+            </w:pPr>
+            <w:r/>
+            <w:r>
+              <w:rPr>
+                <w:b w:val="0"/>
+              </w:rPr>
+              <w:t>12 % bienes. NO USAR.</w:t>
+            </w:r>
+          </w:p>
+        </w:tc>
+        <w:tc>
+          <w:tcPr>
+            <w:tcW w:type="dxa" w:w="5783"/>
+          </w:tcPr>
+          <w:p>
+            <w:pPr>
+              <w:spacing w:after="0"/>
+            </w:pPr>
+            <w:r/>
+            <w:r>
+              <w:rPr>
+                <w:b w:val="0"/>
+              </w:rPr>
+              <w:t>12 % nunca es deducible (típico restaurante/catering con clientes).</w:t>
+            </w:r>
+          </w:p>
+        </w:tc>
+        <w:tc>
+          <w:tcPr>
+            <w:tcW w:type="dxa" w:w="4535"/>
+          </w:tcPr>
+          <w:p>
+            <w:pPr>
+              <w:spacing w:after="0"/>
+            </w:pPr>
+            <w:r/>
+            <w:r>
+              <w:rPr>
+                <w:b w:val="0"/>
+              </w:rPr>
+              <w:t>Ver Q0 para gastos no deducibles. (Pendiente confirmar con SSC.)</w:t>
+            </w:r>
+          </w:p>
+        </w:tc>
+      </w:tr>
+      <w:tr>
+        <w:tc>
+          <w:tcPr>
+            <w:tcW w:type="dxa" w:w="1134"/>
+            <w:shd w:val="clear" w:fill="F2F2F2"/>
+          </w:tcPr>
+          <w:p>
+            <w:pPr>
+              <w:spacing w:after="0"/>
+            </w:pPr>
+            <w:r/>
+            <w:r>
+              <w:rPr>
+                <w:b/>
+              </w:rPr>
+              <w:t>Q8</w:t>
+            </w:r>
+          </w:p>
+        </w:tc>
+        <w:tc>
+          <w:tcPr>
+            <w:tcW w:type="dxa" w:w="3515"/>
+          </w:tcPr>
+          <w:p>
+            <w:pPr>
+              <w:spacing w:after="0"/>
+            </w:pPr>
+            <w:r/>
+            <w:r>
+              <w:rPr>
+                <w:b w:val="0"/>
+              </w:rPr>
+              <w:t>6 % bienes (commodities). NO USAR.</w:t>
+            </w:r>
+          </w:p>
+        </w:tc>
+        <w:tc>
+          <w:tcPr>
+            <w:tcW w:type="dxa" w:w="5783"/>
+          </w:tcPr>
+          <w:p>
+            <w:pPr>
+              <w:spacing w:after="0"/>
+            </w:pPr>
+            <w:r/>
+            <w:r>
+              <w:rPr>
+                <w:b w:val="0"/>
+              </w:rPr>
+              <w:t>—</w:t>
+            </w:r>
+          </w:p>
+        </w:tc>
+        <w:tc>
+          <w:tcPr>
+            <w:tcW w:type="dxa" w:w="4535"/>
+          </w:tcPr>
+          <w:p>
+            <w:pPr>
+              <w:spacing w:after="0"/>
+            </w:pPr>
+            <w:r/>
+            <w:r>
+              <w:rPr>
+                <w:b w:val="0"/>
+              </w:rPr>
+              <w:t>No se usa en las sociedades belgas.</w:t>
+            </w:r>
+          </w:p>
+        </w:tc>
+      </w:tr>
+      <w:tr>
+        <w:tc>
+          <w:tcPr>
+            <w:tcW w:type="dxa" w:w="1134"/>
+            <w:shd w:val="clear" w:fill="F2F2F2"/>
+          </w:tcPr>
+          <w:p>
+            <w:pPr>
+              <w:spacing w:after="0"/>
+            </w:pPr>
+            <w:r/>
+            <w:r>
+              <w:rPr>
+                <w:b/>
+              </w:rPr>
+              <w:t>Q9</w:t>
+            </w:r>
+          </w:p>
+        </w:tc>
+        <w:tc>
+          <w:tcPr>
+            <w:tcW w:type="dxa" w:w="3515"/>
+          </w:tcPr>
+          <w:p>
+            <w:pPr>
+              <w:spacing w:after="0"/>
+            </w:pPr>
+            <w:r/>
+            <w:r>
+              <w:rPr>
+                <w:b w:val="0"/>
+              </w:rPr>
+              <w:t>0 % bienes: autoliquidación local (proveedor no establecido en BE).</w:t>
+            </w:r>
+          </w:p>
+        </w:tc>
+        <w:tc>
+          <w:tcPr>
+            <w:tcW w:type="dxa" w:w="5783"/>
+          </w:tcPr>
+          <w:p>
+            <w:pPr>
+              <w:spacing w:after="0"/>
+            </w:pPr>
+            <w:r/>
+            <w:r>
+              <w:rPr>
+                <w:b w:val="0"/>
+              </w:rPr>
+              <w:t>Solo DS Smith Packaging Netherlands BV (1000002308), compra de papel (DS Smith Paper Sourcing). Tiene NIF-IVA belga pero está establecido en NL; no factura IVA BE. Art. 194 Directiva IVA.</w:t>
+            </w:r>
+          </w:p>
+        </w:tc>
+        <w:tc>
+          <w:tcPr>
+            <w:tcW w:type="dxa" w:w="4535"/>
+          </w:tcPr>
+          <w:p>
+            <w:pPr>
+              <w:spacing w:after="0"/>
+            </w:pPr>
+            <w:r/>
+            <w:r>
+              <w:rPr>
+                <w:b w:val="0"/>
+              </w:rPr>
+              <w:t>Verify y el cockpit lo asignan automáticamente. Todas sus facturas, incluidos rebates.</w:t>
+            </w:r>
+          </w:p>
+        </w:tc>
+      </w:tr>
+      <w:tr>
+        <w:tc>
+          <w:tcPr>
+            <w:tcW w:type="dxa" w:w="1134"/>
+            <w:shd w:val="clear" w:fill="F2F2F2"/>
+          </w:tcPr>
+          <w:p>
+            <w:pPr>
+              <w:spacing w:after="0"/>
+            </w:pPr>
+            <w:r/>
+            <w:r>
+              <w:rPr>
+                <w:b/>
+              </w:rPr>
+              <w:t>QA</w:t>
+            </w:r>
+          </w:p>
+        </w:tc>
+        <w:tc>
+          <w:tcPr>
+            <w:tcW w:type="dxa" w:w="3515"/>
+          </w:tcPr>
+          <w:p>
+            <w:pPr>
+              <w:spacing w:after="0"/>
+            </w:pPr>
+            <w:r/>
+            <w:r>
+              <w:rPr>
+                <w:b w:val="0"/>
+              </w:rPr>
+              <w:t>Sin %: regalos / uso privado (sin deducción).</w:t>
+            </w:r>
+          </w:p>
+        </w:tc>
+        <w:tc>
+          <w:tcPr>
+            <w:tcW w:type="dxa" w:w="5783"/>
+          </w:tcPr>
+          <w:p>
+            <w:pPr>
+              <w:spacing w:after="0"/>
+            </w:pPr>
+            <w:r/>
+            <w:r>
+              <w:rPr>
+                <w:b w:val="0"/>
+              </w:rPr>
+              <w:t>—</w:t>
+            </w:r>
+          </w:p>
+        </w:tc>
+        <w:tc>
+          <w:tcPr>
+            <w:tcW w:type="dxa" w:w="4535"/>
+          </w:tcPr>
+          <w:p>
+            <w:pPr>
+              <w:spacing w:after="0"/>
+            </w:pPr>
+            <w:r/>
+            <w:r>
+              <w:rPr>
+                <w:b w:val="0"/>
+              </w:rPr>
+              <w:t>Sin detalle en el manual.</w:t>
+            </w:r>
+          </w:p>
+        </w:tc>
+      </w:tr>
+      <w:tr>
+        <w:tc>
+          <w:tcPr>
+            <w:tcW w:type="dxa" w:w="1134"/>
+            <w:shd w:val="clear" w:fill="F2F2F2"/>
+          </w:tcPr>
+          <w:p>
+            <w:pPr>
+              <w:spacing w:after="0"/>
+            </w:pPr>
+            <w:r/>
+            <w:r>
+              <w:rPr>
+                <w:b/>
+              </w:rPr>
+              <w:t>QB</w:t>
+            </w:r>
+          </w:p>
+        </w:tc>
+        <w:tc>
+          <w:tcPr>
+            <w:tcW w:type="dxa" w:w="3515"/>
+          </w:tcPr>
+          <w:p>
+            <w:pPr>
+              <w:spacing w:after="0"/>
+            </w:pPr>
+            <w:r/>
+            <w:r>
+              <w:rPr>
+                <w:b w:val="0"/>
+              </w:rPr>
+              <w:t>20 % IVA extranjero Austria.</w:t>
+            </w:r>
+          </w:p>
+        </w:tc>
+        <w:tc>
+          <w:tcPr>
+            <w:tcW w:type="dxa" w:w="5783"/>
+          </w:tcPr>
+          <w:p>
+            <w:pPr>
+              <w:spacing w:after="0"/>
+            </w:pPr>
+            <w:r/>
+            <w:r>
+              <w:rPr>
+                <w:b w:val="0"/>
+              </w:rPr>
+              <w:t>Factura con IVA austriaco.</w:t>
+            </w:r>
+          </w:p>
+        </w:tc>
+        <w:tc>
+          <w:tcPr>
+            <w:tcW w:type="dxa" w:w="4535"/>
+          </w:tcPr>
+          <w:p>
+            <w:pPr>
+              <w:spacing w:after="0"/>
+            </w:pPr>
+            <w:r/>
+            <w:r>
+              <w:rPr>
+                <w:b w:val="0"/>
+              </w:rPr>
+              <w:t>Sin detalle en el manual.</w:t>
+            </w:r>
+          </w:p>
+        </w:tc>
+      </w:tr>
+      <w:tr>
+        <w:tc>
+          <w:tcPr>
+            <w:tcW w:type="dxa" w:w="1134"/>
+            <w:shd w:val="clear" w:fill="F2F2F2"/>
+          </w:tcPr>
+          <w:p>
+            <w:pPr>
+              <w:spacing w:after="0"/>
+            </w:pPr>
+            <w:r/>
+            <w:r>
+              <w:rPr>
+                <w:b/>
+              </w:rPr>
+              <w:t>QC</w:t>
+            </w:r>
+          </w:p>
+        </w:tc>
+        <w:tc>
+          <w:tcPr>
+            <w:tcW w:type="dxa" w:w="3515"/>
+          </w:tcPr>
+          <w:p>
+            <w:pPr>
+              <w:spacing w:after="0"/>
+            </w:pPr>
+            <w:r/>
+            <w:r>
+              <w:rPr>
+                <w:b w:val="0"/>
+              </w:rPr>
+              <w:t>21 % IVA extranjero Países Bajos.</w:t>
+            </w:r>
+          </w:p>
+        </w:tc>
+        <w:tc>
+          <w:tcPr>
+            <w:tcW w:type="dxa" w:w="5783"/>
+          </w:tcPr>
+          <w:p>
+            <w:pPr>
+              <w:spacing w:after="0"/>
+            </w:pPr>
+            <w:r/>
+            <w:r>
+              <w:rPr>
+                <w:b w:val="0"/>
+              </w:rPr>
+              <w:t>Factura con IVA neerlandés.</w:t>
+            </w:r>
+          </w:p>
+        </w:tc>
+        <w:tc>
+          <w:tcPr>
+            <w:tcW w:type="dxa" w:w="4535"/>
+          </w:tcPr>
+          <w:p>
+            <w:pPr>
+              <w:spacing w:after="0"/>
+            </w:pPr>
+            <w:r/>
+            <w:r>
+              <w:rPr>
+                <w:b w:val="0"/>
+              </w:rPr>
+              <w:t>Sin detalle en el manual.</w:t>
+            </w:r>
+          </w:p>
+        </w:tc>
+      </w:tr>
+      <w:tr>
+        <w:tc>
+          <w:tcPr>
+            <w:tcW w:type="dxa" w:w="1134"/>
+            <w:shd w:val="clear" w:fill="F2F2F2"/>
+          </w:tcPr>
+          <w:p>
+            <w:pPr>
+              <w:spacing w:after="0"/>
+            </w:pPr>
+            <w:r/>
+            <w:r>
+              <w:rPr>
+                <w:b/>
+              </w:rPr>
+              <w:t>QD</w:t>
+            </w:r>
+          </w:p>
+        </w:tc>
+        <w:tc>
+          <w:tcPr>
+            <w:tcW w:type="dxa" w:w="3515"/>
+          </w:tcPr>
+          <w:p>
+            <w:pPr>
+              <w:spacing w:after="0"/>
+            </w:pPr>
+            <w:r/>
+            <w:r>
+              <w:rPr>
+                <w:b w:val="0"/>
+              </w:rPr>
+              <w:t>22 % IVA extranjero Italia.</w:t>
+            </w:r>
+          </w:p>
+        </w:tc>
+        <w:tc>
+          <w:tcPr>
+            <w:tcW w:type="dxa" w:w="5783"/>
+          </w:tcPr>
+          <w:p>
+            <w:pPr>
+              <w:spacing w:after="0"/>
+            </w:pPr>
+            <w:r/>
+            <w:r>
+              <w:rPr>
+                <w:b w:val="0"/>
+              </w:rPr>
+              <w:t>Factura con IVA italiano.</w:t>
+            </w:r>
+          </w:p>
+        </w:tc>
+        <w:tc>
+          <w:tcPr>
+            <w:tcW w:type="dxa" w:w="4535"/>
+          </w:tcPr>
+          <w:p>
+            <w:pPr>
+              <w:spacing w:after="0"/>
+            </w:pPr>
+            <w:r/>
+            <w:r>
+              <w:rPr>
+                <w:b w:val="0"/>
+              </w:rPr>
+              <w:t>Sin detalle en el manual.</w:t>
+            </w:r>
+          </w:p>
+        </w:tc>
+      </w:tr>
+      <w:tr>
+        <w:tc>
+          <w:tcPr>
+            <w:tcW w:type="dxa" w:w="1134"/>
+            <w:shd w:val="clear" w:fill="F2F2F2"/>
+          </w:tcPr>
+          <w:p>
+            <w:pPr>
+              <w:spacing w:after="0"/>
+            </w:pPr>
+            <w:r/>
+            <w:r>
+              <w:rPr>
+                <w:b/>
+              </w:rPr>
+              <w:t>QE</w:t>
+            </w:r>
+          </w:p>
+        </w:tc>
+        <w:tc>
+          <w:tcPr>
+            <w:tcW w:type="dxa" w:w="3515"/>
+          </w:tcPr>
+          <w:p>
+            <w:pPr>
+              <w:spacing w:after="0"/>
+            </w:pPr>
+            <w:r/>
+            <w:r>
+              <w:rPr>
+                <w:b w:val="0"/>
+              </w:rPr>
+              <w:t>19 % IVA extranjero Alemania.</w:t>
+            </w:r>
+          </w:p>
+        </w:tc>
+        <w:tc>
+          <w:tcPr>
+            <w:tcW w:type="dxa" w:w="5783"/>
+          </w:tcPr>
+          <w:p>
+            <w:pPr>
+              <w:spacing w:after="0"/>
+            </w:pPr>
+            <w:r/>
+            <w:r>
+              <w:rPr>
+                <w:b w:val="0"/>
+              </w:rPr>
+              <w:t>Factura con IVA alemán.</w:t>
+            </w:r>
+          </w:p>
+        </w:tc>
+        <w:tc>
+          <w:tcPr>
+            <w:tcW w:type="dxa" w:w="4535"/>
+          </w:tcPr>
+          <w:p>
+            <w:pPr>
+              <w:spacing w:after="0"/>
+            </w:pPr>
+            <w:r/>
+            <w:r>
+              <w:rPr>
+                <w:b w:val="0"/>
+              </w:rPr>
+              <w:t>Sin detalle en el manual.</w:t>
+            </w:r>
+          </w:p>
+        </w:tc>
+      </w:tr>
+      <w:tr>
+        <w:tc>
+          <w:tcPr>
+            <w:tcW w:type="dxa" w:w="1134"/>
+            <w:shd w:val="clear" w:fill="F2F2F2"/>
+          </w:tcPr>
+          <w:p>
+            <w:pPr>
+              <w:spacing w:after="0"/>
+            </w:pPr>
+            <w:r/>
+            <w:r>
+              <w:rPr>
+                <w:b/>
+              </w:rPr>
+              <w:t>QF</w:t>
+            </w:r>
+          </w:p>
+        </w:tc>
+        <w:tc>
+          <w:tcPr>
+            <w:tcW w:type="dxa" w:w="3515"/>
+          </w:tcPr>
+          <w:p>
+            <w:pPr>
+              <w:spacing w:after="0"/>
+            </w:pPr>
+            <w:r/>
+            <w:r>
+              <w:rPr>
+                <w:b w:val="0"/>
+              </w:rPr>
+              <w:t>21 % IVA extranjero España.</w:t>
+            </w:r>
+          </w:p>
+        </w:tc>
+        <w:tc>
+          <w:tcPr>
+            <w:tcW w:type="dxa" w:w="5783"/>
+          </w:tcPr>
+          <w:p>
+            <w:pPr>
+              <w:spacing w:after="0"/>
+            </w:pPr>
+            <w:r/>
+            <w:r>
+              <w:rPr>
+                <w:b w:val="0"/>
+              </w:rPr>
+              <w:t>Factura con IVA español.</w:t>
+            </w:r>
+          </w:p>
+        </w:tc>
+        <w:tc>
+          <w:tcPr>
+            <w:tcW w:type="dxa" w:w="4535"/>
+          </w:tcPr>
+          <w:p>
+            <w:pPr>
+              <w:spacing w:after="0"/>
+            </w:pPr>
+            <w:r/>
+            <w:r>
+              <w:rPr>
+                <w:b w:val="0"/>
+              </w:rPr>
+              <w:t>Sin detalle en el manual.</w:t>
+            </w:r>
+          </w:p>
+        </w:tc>
+      </w:tr>
+      <w:tr>
+        <w:tc>
+          <w:tcPr>
+            <w:tcW w:type="dxa" w:w="1134"/>
+            <w:shd w:val="clear" w:fill="F2F2F2"/>
+          </w:tcPr>
+          <w:p>
+            <w:pPr>
+              <w:spacing w:after="0"/>
+            </w:pPr>
+            <w:r/>
+            <w:r>
+              <w:rPr>
+                <w:b/>
+              </w:rPr>
+              <w:t>QG</w:t>
+            </w:r>
+          </w:p>
+        </w:tc>
+        <w:tc>
+          <w:tcPr>
+            <w:tcW w:type="dxa" w:w="3515"/>
+          </w:tcPr>
+          <w:p>
+            <w:pPr>
+              <w:spacing w:after="0"/>
+            </w:pPr>
+            <w:r/>
+            <w:r>
+              <w:rPr>
+                <w:b w:val="0"/>
+              </w:rPr>
+              <w:t>20 % IVA extranjero Francia.</w:t>
+            </w:r>
+          </w:p>
+        </w:tc>
+        <w:tc>
+          <w:tcPr>
+            <w:tcW w:type="dxa" w:w="5783"/>
+          </w:tcPr>
+          <w:p>
+            <w:pPr>
+              <w:spacing w:after="0"/>
+            </w:pPr>
+            <w:r/>
+            <w:r>
+              <w:rPr>
+                <w:b w:val="0"/>
+              </w:rPr>
+              <w:t>Factura con IVA francés.</w:t>
+            </w:r>
+          </w:p>
+        </w:tc>
+        <w:tc>
+          <w:tcPr>
+            <w:tcW w:type="dxa" w:w="4535"/>
+          </w:tcPr>
+          <w:p>
+            <w:pPr>
+              <w:spacing w:after="0"/>
+            </w:pPr>
+            <w:r/>
+            <w:r>
+              <w:rPr>
+                <w:b w:val="0"/>
+              </w:rPr>
+              <w:t>Sin detalle en el manual.</w:t>
+            </w:r>
+          </w:p>
+        </w:tc>
+      </w:tr>
+      <w:tr>
+        <w:tc>
+          <w:tcPr>
+            <w:tcW w:type="dxa" w:w="1134"/>
+            <w:shd w:val="clear" w:fill="F2F2F2"/>
+          </w:tcPr>
+          <w:p>
+            <w:pPr>
+              <w:spacing w:after="0"/>
+            </w:pPr>
+            <w:r/>
+            <w:r>
+              <w:rPr>
+                <w:b/>
+              </w:rPr>
+              <w:t>QH</w:t>
+            </w:r>
+          </w:p>
+        </w:tc>
+        <w:tc>
+          <w:tcPr>
+            <w:tcW w:type="dxa" w:w="3515"/>
+          </w:tcPr>
+          <w:p>
+            <w:pPr>
+              <w:spacing w:after="0"/>
+            </w:pPr>
+            <w:r/>
+            <w:r>
+              <w:rPr>
+                <w:b w:val="0"/>
+              </w:rPr>
+              <w:t>20 % IVA extranjero Reino Unido.</w:t>
+            </w:r>
+          </w:p>
+        </w:tc>
+        <w:tc>
+          <w:tcPr>
+            <w:tcW w:type="dxa" w:w="5783"/>
+          </w:tcPr>
+          <w:p>
+            <w:pPr>
+              <w:spacing w:after="0"/>
+            </w:pPr>
+            <w:r/>
+            <w:r>
+              <w:rPr>
+                <w:b w:val="0"/>
+              </w:rPr>
+              <w:t>Factura con IVA británico.</w:t>
+            </w:r>
+          </w:p>
+        </w:tc>
+        <w:tc>
+          <w:tcPr>
+            <w:tcW w:type="dxa" w:w="4535"/>
+          </w:tcPr>
+          <w:p>
+            <w:pPr>
+              <w:spacing w:after="0"/>
+            </w:pPr>
+            <w:r/>
+            <w:r>
+              <w:rPr>
+                <w:b w:val="0"/>
+              </w:rPr>
+              <w:t>Sin detalle en el manual.</w:t>
+            </w:r>
+          </w:p>
+        </w:tc>
+      </w:tr>
+      <w:tr>
+        <w:tc>
+          <w:tcPr>
+            <w:tcW w:type="dxa" w:w="1134"/>
+            <w:shd w:val="clear" w:fill="F2F2F2"/>
+          </w:tcPr>
+          <w:p>
+            <w:pPr>
+              <w:spacing w:after="0"/>
+            </w:pPr>
+            <w:r/>
+            <w:r>
+              <w:rPr>
+                <w:b/>
+              </w:rPr>
+              <w:t>QI</w:t>
+            </w:r>
+          </w:p>
+        </w:tc>
+        <w:tc>
+          <w:tcPr>
+            <w:tcW w:type="dxa" w:w="3515"/>
+          </w:tcPr>
+          <w:p>
+            <w:pPr>
+              <w:spacing w:after="0"/>
+            </w:pPr>
+            <w:r/>
+            <w:r>
+              <w:rPr>
+                <w:b w:val="0"/>
+              </w:rPr>
+              <w:t>21 % servicios, 65 % no deducible (35 % deducible).</w:t>
+            </w:r>
+          </w:p>
+        </w:tc>
+        <w:tc>
+          <w:tcPr>
+            <w:tcW w:type="dxa" w:w="5783"/>
+          </w:tcPr>
+          <w:p>
+            <w:pPr>
+              <w:spacing w:after="0"/>
+            </w:pPr>
+            <w:r/>
+            <w:r>
+              <w:rPr>
+                <w:b w:val="0"/>
+              </w:rPr>
+              <w:t>Leasing y gastos de coches de empresa (mantenimiento, combustible): KBC Autolease 1000003080, Alphabet 1000016478, AXUS/ALD 1000002716, Arval 1000027841.</w:t>
+            </w:r>
+          </w:p>
+        </w:tc>
+        <w:tc>
+          <w:tcPr>
+            <w:tcW w:type="dxa" w:w="4535"/>
           </w:tcPr>
           <w:p>
             <w:pPr>
@@ -624,7 +1547,7 @@
         </w:tc>
         <w:tc>
           <w:tcPr>
-            <w:tcW w:type="dxa" w:w="4649"/>
+            <w:tcW w:type="dxa" w:w="3515"/>
           </w:tcPr>
           <w:p>
             <w:pPr>
@@ -635,13 +1558,13 @@
               <w:rPr>
                 <w:b w:val="0"/>
               </w:rPr>
-              <w:t>Móviles con 21%: 75% deducible.</w:t>
+              <w:t>21 % servicios, 25 % no deducible (75 % deducible).</w:t>
             </w:r>
           </w:p>
         </w:tc>
         <w:tc>
           <w:tcPr>
-            <w:tcW w:type="dxa" w:w="4876"/>
+            <w:tcW w:type="dxa" w:w="5783"/>
           </w:tcPr>
           <w:p>
             <w:pPr>
@@ -652,13 +1575,13 @@
               <w:rPr>
                 <w:b w:val="0"/>
               </w:rPr>
-              <w:t>Proximus, cuenta GL 633010 (móviles).</w:t>
+              <w:t>Móviles: Proximus, cuenta GL 633010.</w:t>
             </w:r>
           </w:p>
         </w:tc>
         <w:tc>
           <w:tcPr>
-            <w:tcW w:type="dxa" w:w="4309"/>
+            <w:tcW w:type="dxa" w:w="4535"/>
           </w:tcPr>
           <w:p>
             <w:pPr>
@@ -669,7 +1592,231 @@
               <w:rPr>
                 <w:b w:val="0"/>
               </w:rPr>
-              <w:t>Las facturas llegan cargadas con QJ: cambiar a QK si no es telefonía móvil (líneas fijas, internet).</w:t>
+              <w:t>Las facturas llegan con QJ: cambiar a QK si no es móvil (líneas fijas, internet).</w:t>
+            </w:r>
+          </w:p>
+        </w:tc>
+      </w:tr>
+      <w:tr>
+        <w:tc>
+          <w:tcPr>
+            <w:tcW w:type="dxa" w:w="1134"/>
+            <w:shd w:val="clear" w:fill="F2F2F2"/>
+          </w:tcPr>
+          <w:p>
+            <w:pPr>
+              <w:spacing w:after="0"/>
+            </w:pPr>
+            <w:r/>
+            <w:r>
+              <w:rPr>
+                <w:b/>
+              </w:rPr>
+              <w:t>QK</w:t>
+            </w:r>
+          </w:p>
+        </w:tc>
+        <w:tc>
+          <w:tcPr>
+            <w:tcW w:type="dxa" w:w="3515"/>
+          </w:tcPr>
+          <w:p>
+            <w:pPr>
+              <w:spacing w:after="0"/>
+            </w:pPr>
+            <w:r/>
+            <w:r>
+              <w:rPr>
+                <w:b w:val="0"/>
+              </w:rPr>
+              <w:t>21 % servicios y bienes diversos.</w:t>
+            </w:r>
+          </w:p>
+        </w:tc>
+        <w:tc>
+          <w:tcPr>
+            <w:tcW w:type="dxa" w:w="5783"/>
+          </w:tcPr>
+          <w:p>
+            <w:pPr>
+              <w:spacing w:after="0"/>
+            </w:pPr>
+            <w:r/>
+            <w:r>
+              <w:rPr>
+                <w:b w:val="0"/>
+              </w:rPr>
+              <w:t>Proveedor BE con 21 % de servicios o bienes diversos. PO Coupa 3000…: siempre QK.</w:t>
+            </w:r>
+          </w:p>
+        </w:tc>
+        <w:tc>
+          <w:tcPr>
+            <w:tcW w:type="dxa" w:w="4535"/>
+          </w:tcPr>
+          <w:p>
+            <w:pPr>
+              <w:spacing w:after="0"/>
+            </w:pPr>
+            <w:r/>
+            <w:r>
+              <w:rPr>
+                <w:b w:val="0"/>
+              </w:rPr>
+              <w:t>Único código de 21 % en DSSPM.</w:t>
+            </w:r>
+          </w:p>
+          <w:p>
+            <w:pPr>
+              <w:spacing w:after="0"/>
+            </w:pPr>
+            <w:r>
+              <w:rPr>
+                <w:b w:val="0"/>
+              </w:rPr>
+              <w:t>Si la PO es 45… manda la SAP Tax Table.</w:t>
+            </w:r>
+          </w:p>
+        </w:tc>
+      </w:tr>
+      <w:tr>
+        <w:tc>
+          <w:tcPr>
+            <w:tcW w:type="dxa" w:w="1134"/>
+            <w:shd w:val="clear" w:fill="F2F2F2"/>
+          </w:tcPr>
+          <w:p>
+            <w:pPr>
+              <w:spacing w:after="0"/>
+            </w:pPr>
+            <w:r/>
+            <w:r>
+              <w:rPr>
+                <w:b/>
+              </w:rPr>
+              <w:t>QL</w:t>
+            </w:r>
+          </w:p>
+        </w:tc>
+        <w:tc>
+          <w:tcPr>
+            <w:tcW w:type="dxa" w:w="3515"/>
+          </w:tcPr>
+          <w:p>
+            <w:pPr>
+              <w:spacing w:after="0"/>
+            </w:pPr>
+            <w:r/>
+            <w:r>
+              <w:rPr>
+                <w:b w:val="0"/>
+              </w:rPr>
+              <w:t>12 % servicios. NO USAR.</w:t>
+            </w:r>
+          </w:p>
+        </w:tc>
+        <w:tc>
+          <w:tcPr>
+            <w:tcW w:type="dxa" w:w="5783"/>
+          </w:tcPr>
+          <w:p>
+            <w:pPr>
+              <w:spacing w:after="0"/>
+            </w:pPr>
+            <w:r/>
+            <w:r>
+              <w:rPr>
+                <w:b w:val="0"/>
+              </w:rPr>
+              <w:t>—</w:t>
+            </w:r>
+          </w:p>
+        </w:tc>
+        <w:tc>
+          <w:tcPr>
+            <w:tcW w:type="dxa" w:w="4535"/>
+          </w:tcPr>
+          <w:p>
+            <w:pPr>
+              <w:spacing w:after="0"/>
+            </w:pPr>
+            <w:r/>
+            <w:r>
+              <w:rPr>
+                <w:b w:val="0"/>
+              </w:rPr>
+              <w:t>Ver Q7.</w:t>
+            </w:r>
+          </w:p>
+        </w:tc>
+      </w:tr>
+      <w:tr>
+        <w:tc>
+          <w:tcPr>
+            <w:tcW w:type="dxa" w:w="1134"/>
+            <w:shd w:val="clear" w:fill="F2F2F2"/>
+          </w:tcPr>
+          <w:p>
+            <w:pPr>
+              <w:spacing w:after="0"/>
+            </w:pPr>
+            <w:r/>
+            <w:r>
+              <w:rPr>
+                <w:b/>
+              </w:rPr>
+              <w:t>QM</w:t>
+            </w:r>
+          </w:p>
+        </w:tc>
+        <w:tc>
+          <w:tcPr>
+            <w:tcW w:type="dxa" w:w="3515"/>
+          </w:tcPr>
+          <w:p>
+            <w:pPr>
+              <w:spacing w:after="0"/>
+            </w:pPr>
+            <w:r/>
+            <w:r>
+              <w:rPr>
+                <w:b w:val="0"/>
+              </w:rPr>
+              <w:t>6 % servicios y bienes diversos.</w:t>
+            </w:r>
+          </w:p>
+        </w:tc>
+        <w:tc>
+          <w:tcPr>
+            <w:tcW w:type="dxa" w:w="5783"/>
+          </w:tcPr>
+          <w:p>
+            <w:pPr>
+              <w:spacing w:after="0"/>
+            </w:pPr>
+            <w:r/>
+            <w:r>
+              <w:rPr>
+                <w:b w:val="0"/>
+              </w:rPr>
+              <w:t>Agua de red (De Watergroep 1000016615, TMVW 1000016594), taxi, agua potable/refrescos/fruta, medicamentos, periódicos y libros.</w:t>
+            </w:r>
+          </w:p>
+        </w:tc>
+        <w:tc>
+          <w:tcPr>
+            <w:tcW w:type="dxa" w:w="4535"/>
+          </w:tcPr>
+          <w:p>
+            <w:pPr>
+              <w:spacing w:after="0"/>
+            </w:pPr>
+            <w:r/>
+            <w:r>
+              <w:rPr>
+                <w:b w:val="0"/>
+              </w:rPr>
+              <w:t>—</w:t>
             </w:r>
           </w:p>
         </w:tc>
@@ -695,7 +1842,7 @@
         </w:tc>
         <w:tc>
           <w:tcPr>
-            <w:tcW w:type="dxa" w:w="4649"/>
+            <w:tcW w:type="dxa" w:w="3515"/>
           </w:tcPr>
           <w:p>
             <w:pPr>
@@ -706,13 +1853,13 @@
               <w:rPr>
                 <w:b w:val="0"/>
               </w:rPr>
-              <w:t>Autoliquidación local de servicios (obras sobre inmuebles/máquinas).</w:t>
+              <w:t>0 % servicios: autoliquidación local (obras en inmuebles/instalaciones).</w:t>
             </w:r>
           </w:p>
         </w:tc>
         <w:tc>
           <w:tcPr>
-            <w:tcW w:type="dxa" w:w="4876"/>
+            <w:tcW w:type="dxa" w:w="5783"/>
           </w:tcPr>
           <w:p>
             <w:pPr>
@@ -723,13 +1870,24 @@
               <w:rPr>
                 <w:b w:val="0"/>
               </w:rPr>
-              <w:t>Contratista BE sin IVA, con mención "BTW verlegd" / "reverse charge" / art. 20 K.B. nº1. Limpieza de edificios, pintura, reparaciones y mantenimiento de máquinas (las máquinas de cartón son parte del inmueble).</w:t>
+              <w:t>Contratista BE: no cobra IVA por art. 20 K.B. nº 1; suele indicar "BTW verlegd" / "reverse charge" (obligatorio mencionarlo). Limpieza de edificios, pintura, reparaciones y mantenimiento de máquinas.</w:t>
+            </w:r>
+          </w:p>
+          <w:p>
+            <w:pPr>
+              <w:spacing w:after="0"/>
+            </w:pPr>
+            <w:r>
+              <w:rPr>
+                <w:b w:val="0"/>
+              </w:rPr>
+              <w:t>Proveedor UE que instala en Bélgica: art. 194 Directiva IVA (normalmente activos fijos de importe alto).</w:t>
             </w:r>
           </w:p>
         </w:tc>
         <w:tc>
           <w:tcPr>
-            <w:tcW w:type="dxa" w:w="4309"/>
+            <w:tcW w:type="dxa" w:w="4535"/>
           </w:tcPr>
           <w:p>
             <w:pPr>
@@ -740,29 +1898,18 @@
               <w:rPr>
                 <w:b w:val="0"/>
               </w:rPr>
-              <w:t>También para proveedor UE que instala (ver sección 2).</w:t>
+              <w:t>Solo UE, no existe fuera de la UE.</w:t>
             </w:r>
           </w:p>
-        </w:tc>
-      </w:tr>
-      <w:tr>
-        <w:tc>
-          <w:tcPr>
-            <w:tcW w:type="dxa" w:w="15364"/>
-            <w:gridSpan w:val="4"/>
-            <w:shd w:val="clear" w:fill="DCE6F1"/>
-          </w:tcPr>
           <w:p>
             <w:pPr>
               <w:spacing w:after="0"/>
             </w:pPr>
-            <w:r/>
             <w:r>
               <w:rPr>
-                <w:b/>
-                <w:color w:val="1F3A5F"/>
+                <w:b w:val="0"/>
               </w:rPr>
-              <w:t>2. PROVEEDOR UE (otro país UE, con NIF-IVA de la UE)</w:t>
+              <w:t>No confundir con Q5; el proveedor no siempre cita el artículo: revisar si hay instalación.</w:t>
             </w:r>
           </w:p>
         </w:tc>
@@ -782,13 +1929,13 @@
               <w:rPr>
                 <w:b/>
               </w:rPr>
-              <w:t>Q4</w:t>
+              <w:t>QT</w:t>
             </w:r>
           </w:p>
         </w:tc>
         <w:tc>
           <w:tcPr>
-            <w:tcW w:type="dxa" w:w="4649"/>
+            <w:tcW w:type="dxa" w:w="3515"/>
           </w:tcPr>
           <w:p>
             <w:pPr>
@@ -799,494 +1946,13 @@
               <w:rPr>
                 <w:b w:val="0"/>
               </w:rPr>
-              <w:t>Compra intracomunitaria de BIENES. Autoliquidación.</w:t>
+              <w:t>Triangular, compra de bienes. NO USAR (de momento).</w:t>
             </w:r>
           </w:p>
         </w:tc>
         <w:tc>
           <w:tcPr>
-            <w:tcW w:type="dxa" w:w="4876"/>
-          </w:tcPr>
-          <w:p>
-            <w:pPr>
-              <w:spacing w:after="0"/>
-            </w:pPr>
-            <w:r/>
-            <w:r>
-              <w:rPr>
-                <w:b w:val="0"/>
-              </w:rPr>
-              <w:t>NIF-IVA UE (no BE) en la factura. Textos: "Intracommunautaire levering", "Intra-community delivery", "Livraison intracommunautaire exonérée de TVA", "Directive 2006/112/EC", códigos de mercancía, peso, Incoterms.</w:t>
-            </w:r>
-          </w:p>
-        </w:tc>
-        <w:tc>
-          <w:tcPr>
-            <w:tcW w:type="dxa" w:w="4309"/>
-          </w:tcPr>
-          <w:p>
-            <w:pPr>
-              <w:spacing w:after="0"/>
-            </w:pPr>
-            <w:r/>
-            <w:r>
-              <w:rPr>
-                <w:b w:val="0"/>
-              </w:rPr>
-              <w:t>Vale para todos los bienes (no se separa commodity/diverso).</w:t>
-            </w:r>
-          </w:p>
-        </w:tc>
-      </w:tr>
-      <w:tr>
-        <w:tc>
-          <w:tcPr>
-            <w:tcW w:type="dxa" w:w="1134"/>
-            <w:shd w:val="clear" w:fill="F2F2F2"/>
-          </w:tcPr>
-          <w:p>
-            <w:pPr>
-              <w:spacing w:after="0"/>
-            </w:pPr>
-            <w:r/>
-            <w:r>
-              <w:rPr>
-                <w:b/>
-              </w:rPr>
-              <w:t>Q5</w:t>
-            </w:r>
-          </w:p>
-        </w:tc>
-        <w:tc>
-          <w:tcPr>
-            <w:tcW w:type="dxa" w:w="4649"/>
-          </w:tcPr>
-          <w:p>
-            <w:pPr>
-              <w:spacing w:after="0"/>
-            </w:pPr>
-            <w:r/>
-            <w:r>
-              <w:rPr>
-                <w:b w:val="0"/>
-              </w:rPr>
-              <w:t>Compra intracomunitaria de SERVICIOS. Autoliquidación.</w:t>
-            </w:r>
-          </w:p>
-        </w:tc>
-        <w:tc>
-          <w:tcPr>
-            <w:tcW w:type="dxa" w:w="4876"/>
-          </w:tcPr>
-          <w:p>
-            <w:pPr>
-              <w:spacing w:after="0"/>
-            </w:pPr>
-            <w:r/>
-            <w:r>
-              <w:rPr>
-                <w:b w:val="0"/>
-              </w:rPr>
-              <w:t>Servicios facturados sin IVA por proveedor UE: transporte, mantenimiento/consultoría IT, recharges intercompany, alquileres, comisiones, trabajos de mantenimiento.</w:t>
-            </w:r>
-          </w:p>
-        </w:tc>
-        <w:tc>
-          <w:tcPr>
-            <w:tcW w:type="dxa" w:w="4309"/>
-          </w:tcPr>
-          <w:p>
-            <w:pPr>
-              <w:spacing w:after="0"/>
-            </w:pPr>
-            <w:r/>
-            <w:r>
-              <w:rPr>
-                <w:b w:val="0"/>
-              </w:rPr>
-              <w:t>Art. 44: el servicio tributa en Bélgica.</w:t>
-            </w:r>
-          </w:p>
-          <w:p>
-            <w:pPr>
-              <w:spacing w:after="0"/>
-            </w:pPr>
-            <w:r>
-              <w:rPr>
-                <w:b w:val="0"/>
-              </w:rPr>
-              <w:t>Excepciones con IVA local extranjero: formación en otro país UE y restaurantes locales.</w:t>
-            </w:r>
-          </w:p>
-          <w:p>
-            <w:pPr>
-              <w:spacing w:after="0"/>
-            </w:pPr>
-            <w:r>
-              <w:rPr>
-                <w:b w:val="0"/>
-              </w:rPr>
-              <w:t>DSSPM: consultoría con IVA extranjero es incorrecto: pedir nueva factura con autoliquidación.</w:t>
-            </w:r>
-          </w:p>
-          <w:p>
-            <w:pPr>
-              <w:spacing w:after="0"/>
-            </w:pPr>
-            <w:r>
-              <w:rPr>
-                <w:b w:val="0"/>
-              </w:rPr>
-              <w:t>Un mismo proveedor puede vender bienes y servicios (Q4 y Q5).</w:t>
-            </w:r>
-          </w:p>
-        </w:tc>
-      </w:tr>
-      <w:tr>
-        <w:tc>
-          <w:tcPr>
-            <w:tcW w:type="dxa" w:w="1134"/>
-            <w:shd w:val="clear" w:fill="F2F2F2"/>
-          </w:tcPr>
-          <w:p>
-            <w:pPr>
-              <w:spacing w:after="0"/>
-            </w:pPr>
-            <w:r/>
-            <w:r>
-              <w:rPr>
-                <w:b/>
-              </w:rPr>
-              <w:t>QN</w:t>
-            </w:r>
-          </w:p>
-        </w:tc>
-        <w:tc>
-          <w:tcPr>
-            <w:tcW w:type="dxa" w:w="4649"/>
-          </w:tcPr>
-          <w:p>
-            <w:pPr>
-              <w:spacing w:after="0"/>
-            </w:pPr>
-            <w:r/>
-            <w:r>
-              <w:rPr>
-                <w:b w:val="0"/>
-              </w:rPr>
-              <w:t>Proveedor UE que instala/monta en Bélgica (autoliquidación local).</w:t>
-            </w:r>
-          </w:p>
-        </w:tc>
-        <w:tc>
-          <w:tcPr>
-            <w:tcW w:type="dxa" w:w="4876"/>
-          </w:tcPr>
-          <w:p>
-            <w:pPr>
-              <w:spacing w:after="0"/>
-            </w:pPr>
-            <w:r/>
-            <w:r>
-              <w:rPr>
-                <w:b w:val="0"/>
-              </w:rPr>
-              <w:t>Mención del art. 194 de la Directiva UE o "reverse charge". Normalmente instalaciones de activos fijos (importes altos).</w:t>
-            </w:r>
-          </w:p>
-        </w:tc>
-        <w:tc>
-          <w:tcPr>
-            <w:tcW w:type="dxa" w:w="4309"/>
-          </w:tcPr>
-          <w:p>
-            <w:pPr>
-              <w:spacing w:after="0"/>
-            </w:pPr>
-            <w:r/>
-            <w:r>
-              <w:rPr>
-                <w:b w:val="0"/>
-              </w:rPr>
-              <w:t>No confundir con Q5. El proveedor no siempre cita el artículo: revisar si hay instalación.</w:t>
-            </w:r>
-          </w:p>
-        </w:tc>
-      </w:tr>
-      <w:tr>
-        <w:tc>
-          <w:tcPr>
-            <w:tcW w:type="dxa" w:w="1134"/>
-            <w:shd w:val="clear" w:fill="F2F2F2"/>
-          </w:tcPr>
-          <w:p>
-            <w:pPr>
-              <w:spacing w:after="0"/>
-            </w:pPr>
-            <w:r/>
-            <w:r>
-              <w:rPr>
-                <w:b/>
-              </w:rPr>
-              <w:t>Q9</w:t>
-            </w:r>
-          </w:p>
-        </w:tc>
-        <w:tc>
-          <w:tcPr>
-            <w:tcW w:type="dxa" w:w="4649"/>
-          </w:tcPr>
-          <w:p>
-            <w:pPr>
-              <w:spacing w:after="0"/>
-            </w:pPr>
-            <w:r/>
-            <w:r>
-              <w:rPr>
-                <w:b w:val="0"/>
-              </w:rPr>
-              <w:t>Autoliquidación local de BIENES. Solo un proveedor.</w:t>
-            </w:r>
-          </w:p>
-        </w:tc>
-        <w:tc>
-          <w:tcPr>
-            <w:tcW w:type="dxa" w:w="4876"/>
-          </w:tcPr>
-          <w:p>
-            <w:pPr>
-              <w:spacing w:after="0"/>
-            </w:pPr>
-            <w:r/>
-            <w:r>
-              <w:rPr>
-                <w:b w:val="0"/>
-              </w:rPr>
-              <w:t>DS Smith Packaging Netherlands BV (1000002308), compra de papel (DS Smith Paper Sourcing). Sin IVA BE, art. 194. Incluye rebates.</w:t>
-            </w:r>
-          </w:p>
-        </w:tc>
-        <w:tc>
-          <w:tcPr>
-            <w:tcW w:type="dxa" w:w="4309"/>
-          </w:tcPr>
-          <w:p>
-            <w:pPr>
-              <w:spacing w:after="0"/>
-            </w:pPr>
-            <w:r/>
-            <w:r>
-              <w:rPr>
-                <w:b w:val="0"/>
-              </w:rPr>
-              <w:t>Verify y el cockpit lo asignan automáticamente.</w:t>
-            </w:r>
-          </w:p>
-        </w:tc>
-      </w:tr>
-      <w:tr>
-        <w:tc>
-          <w:tcPr>
-            <w:tcW w:type="dxa" w:w="15364"/>
-            <w:gridSpan w:val="4"/>
-            <w:shd w:val="clear" w:fill="DCE6F1"/>
-          </w:tcPr>
-          <w:p>
-            <w:pPr>
-              <w:spacing w:after="0"/>
-            </w:pPr>
-            <w:r/>
-            <w:r>
-              <w:rPr>
-                <w:b/>
-                <w:color w:val="1F3A5F"/>
-              </w:rPr>
-              <w:t>3. PROVEEDOR FUERA DE LA UE (CH, GB, TR…) – GB es "fuera de la UE" desde 01/01/2021</w:t>
-            </w:r>
-          </w:p>
-        </w:tc>
-      </w:tr>
-      <w:tr>
-        <w:tc>
-          <w:tcPr>
-            <w:tcW w:type="dxa" w:w="1134"/>
-            <w:shd w:val="clear" w:fill="F2F2F2"/>
-          </w:tcPr>
-          <w:p>
-            <w:pPr>
-              <w:spacing w:after="0"/>
-            </w:pPr>
-            <w:r/>
-            <w:r>
-              <w:rPr>
-                <w:b/>
-              </w:rPr>
-              <w:t>Q6</w:t>
-            </w:r>
-          </w:p>
-        </w:tc>
-        <w:tc>
-          <w:tcPr>
-            <w:tcW w:type="dxa" w:w="4649"/>
-          </w:tcPr>
-          <w:p>
-            <w:pPr>
-              <w:spacing w:after="0"/>
-            </w:pPr>
-            <w:r/>
-            <w:r>
-              <w:rPr>
-                <w:b w:val="0"/>
-              </w:rPr>
-              <w:t>Importación de SERVICIOS. Autoliquidación.</w:t>
-            </w:r>
-          </w:p>
-        </w:tc>
-        <w:tc>
-          <w:tcPr>
-            <w:tcW w:type="dxa" w:w="4876"/>
-          </w:tcPr>
-          <w:p>
-            <w:pPr>
-              <w:spacing w:after="0"/>
-            </w:pPr>
-            <w:r/>
-            <w:r>
-              <w:rPr>
-                <w:b w:val="0"/>
-              </w:rPr>
-              <w:t>Facturas de países no UE, normalmente sin detalle de IVA (0% o importe 0). Todo recharge de DS Smith UK.</w:t>
-            </w:r>
-          </w:p>
-        </w:tc>
-        <w:tc>
-          <w:tcPr>
-            <w:tcW w:type="dxa" w:w="4309"/>
-          </w:tcPr>
-          <w:p>
-            <w:pPr>
-              <w:spacing w:after="0"/>
-            </w:pPr>
-            <w:r/>
-            <w:r>
-              <w:rPr>
-                <w:b w:val="0"/>
-              </w:rPr>
-              <w:t>Usar Q6, no Q5. Revisar bien el NIF-IVA y qué se entrega.</w:t>
-            </w:r>
-          </w:p>
-        </w:tc>
-      </w:tr>
-      <w:tr>
-        <w:tc>
-          <w:tcPr>
-            <w:tcW w:type="dxa" w:w="1134"/>
-            <w:shd w:val="clear" w:fill="F2F2F2"/>
-          </w:tcPr>
-          <w:p>
-            <w:pPr>
-              <w:spacing w:after="0"/>
-            </w:pPr>
-            <w:r/>
-            <w:r>
-              <w:rPr>
-                <w:b/>
-              </w:rPr>
-              <w:t>Q0</w:t>
-            </w:r>
-          </w:p>
-        </w:tc>
-        <w:tc>
-          <w:tcPr>
-            <w:tcW w:type="dxa" w:w="4649"/>
-          </w:tcPr>
-          <w:p>
-            <w:pPr>
-              <w:spacing w:after="0"/>
-            </w:pPr>
-            <w:r/>
-            <w:r>
-              <w:rPr>
-                <w:b w:val="0"/>
-              </w:rPr>
-              <w:t>Importación de BIENES con documentos de aduana.</w:t>
-            </w:r>
-          </w:p>
-        </w:tc>
-        <w:tc>
-          <w:tcPr>
-            <w:tcW w:type="dxa" w:w="4876"/>
-          </w:tcPr>
-          <w:p>
-            <w:pPr>
-              <w:spacing w:after="0"/>
-            </w:pPr>
-            <w:r/>
-            <w:r>
-              <w:rPr>
-                <w:b w:val="0"/>
-              </w:rPr>
-              <w:t>Factura de bienes de fuera de la UE (p. ej. Simpson/Dawes, Ossett GB 1000030093).</w:t>
-            </w:r>
-          </w:p>
-        </w:tc>
-        <w:tc>
-          <w:tcPr>
-            <w:tcW w:type="dxa" w:w="4309"/>
-          </w:tcPr>
-          <w:p>
-            <w:pPr>
-              <w:spacing w:after="0"/>
-            </w:pPr>
-            <w:r/>
-            <w:r>
-              <w:rPr>
-                <w:b w:val="0"/>
-              </w:rPr>
-              <w:t>Se registra con Q0. El SSC local hace el asiento manual de autoliquidación con los documentos de aduana (broker Mainfreight).</w:t>
-            </w:r>
-          </w:p>
-        </w:tc>
-      </w:tr>
-      <w:tr>
-        <w:tc>
-          <w:tcPr>
-            <w:tcW w:type="dxa" w:w="1134"/>
-            <w:shd w:val="clear" w:fill="F2F2F2"/>
-          </w:tcPr>
-          <w:p>
-            <w:pPr>
-              <w:spacing w:after="0"/>
-            </w:pPr>
-            <w:r/>
-            <w:r>
-              <w:rPr>
-                <w:b/>
-              </w:rPr>
-              <w:t>Q2</w:t>
-            </w:r>
-          </w:p>
-        </w:tc>
-        <w:tc>
-          <w:tcPr>
-            <w:tcW w:type="dxa" w:w="4649"/>
-          </w:tcPr>
-          <w:p>
-            <w:pPr>
-              <w:spacing w:after="0"/>
-            </w:pPr>
-            <w:r/>
-            <w:r>
-              <w:rPr>
-                <w:b w:val="0"/>
-              </w:rPr>
-              <w:t>Import IVA a pagar.</w:t>
-            </w:r>
-          </w:p>
-        </w:tc>
-        <w:tc>
-          <w:tcPr>
-            <w:tcW w:type="dxa" w:w="4876"/>
+            <w:tcW w:type="dxa" w:w="5783"/>
           </w:tcPr>
           <w:p>
             <w:pPr>
@@ -1303,242 +1969,7 @@
         </w:tc>
         <w:tc>
           <w:tcPr>
-            <w:tcW w:type="dxa" w:w="4309"/>
-          </w:tcPr>
-          <w:p>
-            <w:pPr>
-              <w:spacing w:after="0"/>
-            </w:pPr>
-            <w:r/>
-            <w:r>
-              <w:rPr>
-                <w:b w:val="0"/>
-              </w:rPr>
-              <w:t>NO se puede usar en ninguna factura.</w:t>
-            </w:r>
-          </w:p>
-        </w:tc>
-      </w:tr>
-      <w:tr>
-        <w:tc>
-          <w:tcPr>
-            <w:tcW w:type="dxa" w:w="15364"/>
-            <w:gridSpan w:val="4"/>
-            <w:shd w:val="clear" w:fill="DCE6F1"/>
-          </w:tcPr>
-          <w:p>
-            <w:pPr>
-              <w:spacing w:after="0"/>
-            </w:pPr>
-            <w:r/>
-            <w:r>
-              <w:rPr>
-                <w:b/>
-                <w:color w:val="1F3A5F"/>
-              </w:rPr>
-              <w:t>4. OTROS</w:t>
-            </w:r>
-          </w:p>
-        </w:tc>
-      </w:tr>
-      <w:tr>
-        <w:tc>
-          <w:tcPr>
-            <w:tcW w:type="dxa" w:w="1134"/>
-            <w:shd w:val="clear" w:fill="F2F2F2"/>
-          </w:tcPr>
-          <w:p>
-            <w:pPr>
-              <w:spacing w:after="0"/>
-            </w:pPr>
-            <w:r/>
-            <w:r>
-              <w:rPr>
-                <w:b/>
-              </w:rPr>
-              <w:t>QA</w:t>
-            </w:r>
-          </w:p>
-        </w:tc>
-        <w:tc>
-          <w:tcPr>
-            <w:tcW w:type="dxa" w:w="4649"/>
-          </w:tcPr>
-          <w:p>
-            <w:pPr>
-              <w:spacing w:after="0"/>
-            </w:pPr>
-            <w:r/>
-            <w:r>
-              <w:rPr>
-                <w:b w:val="0"/>
-              </w:rPr>
-              <w:t>Regalos / uso privado (sin deducción).</w:t>
-            </w:r>
-          </w:p>
-        </w:tc>
-        <w:tc>
-          <w:tcPr>
-            <w:tcW w:type="dxa" w:w="4876"/>
-          </w:tcPr>
-          <w:p>
-            <w:pPr>
-              <w:spacing w:after="0"/>
-            </w:pPr>
-            <w:r/>
-            <w:r>
-              <w:rPr>
-                <w:b w:val="0"/>
-              </w:rPr>
-              <w:t>—</w:t>
-            </w:r>
-          </w:p>
-        </w:tc>
-        <w:tc>
-          <w:tcPr>
-            <w:tcW w:type="dxa" w:w="4309"/>
-          </w:tcPr>
-          <w:p>
-            <w:pPr>
-              <w:spacing w:after="0"/>
-            </w:pPr>
-            <w:r/>
-            <w:r>
-              <w:rPr>
-                <w:b w:val="0"/>
-              </w:rPr>
-              <w:t>Sin detalle en el manual.</w:t>
-            </w:r>
-          </w:p>
-        </w:tc>
-      </w:tr>
-      <w:tr>
-        <w:tc>
-          <w:tcPr>
-            <w:tcW w:type="dxa" w:w="1134"/>
-            <w:shd w:val="clear" w:fill="F2F2F2"/>
-          </w:tcPr>
-          <w:p>
-            <w:pPr>
-              <w:spacing w:after="0"/>
-            </w:pPr>
-            <w:r/>
-            <w:r>
-              <w:rPr>
-                <w:b/>
-              </w:rPr>
-              <w:t>QB–QH</w:t>
-            </w:r>
-          </w:p>
-        </w:tc>
-        <w:tc>
-          <w:tcPr>
-            <w:tcW w:type="dxa" w:w="4649"/>
-          </w:tcPr>
-          <w:p>
-            <w:pPr>
-              <w:spacing w:after="0"/>
-            </w:pPr>
-            <w:r/>
-            <w:r>
-              <w:rPr>
-                <w:b w:val="0"/>
-              </w:rPr>
-              <w:t>IVA extranjero: AT 20% (QB), NL 21% (QC), IT 22% (QD), DE 19% (QE), ES 21% (QF), FR 20% (QG), GB 20% (QH).</w:t>
-            </w:r>
-          </w:p>
-        </w:tc>
-        <w:tc>
-          <w:tcPr>
-            <w:tcW w:type="dxa" w:w="4876"/>
-          </w:tcPr>
-          <w:p>
-            <w:pPr>
-              <w:spacing w:after="0"/>
-            </w:pPr>
-            <w:r/>
-            <w:r>
-              <w:rPr>
-                <w:b w:val="0"/>
-              </w:rPr>
-              <w:t>Factura con IVA de ese país.</w:t>
-            </w:r>
-          </w:p>
-        </w:tc>
-        <w:tc>
-          <w:tcPr>
-            <w:tcW w:type="dxa" w:w="4309"/>
-          </w:tcPr>
-          <w:p>
-            <w:pPr>
-              <w:spacing w:after="0"/>
-            </w:pPr>
-            <w:r/>
-            <w:r>
-              <w:rPr>
-                <w:b w:val="0"/>
-              </w:rPr>
-              <w:t>Sin detalle en el manual.</w:t>
-            </w:r>
-          </w:p>
-        </w:tc>
-      </w:tr>
-      <w:tr>
-        <w:tc>
-          <w:tcPr>
-            <w:tcW w:type="dxa" w:w="1134"/>
-            <w:shd w:val="clear" w:fill="F2F2F2"/>
-          </w:tcPr>
-          <w:p>
-            <w:pPr>
-              <w:spacing w:after="0"/>
-            </w:pPr>
-            <w:r/>
-            <w:r>
-              <w:rPr>
-                <w:b/>
-              </w:rPr>
-              <w:t>Q7 / QL / Q8 / QT</w:t>
-            </w:r>
-          </w:p>
-        </w:tc>
-        <w:tc>
-          <w:tcPr>
-            <w:tcW w:type="dxa" w:w="4649"/>
-          </w:tcPr>
-          <w:p>
-            <w:pPr>
-              <w:spacing w:after="0"/>
-            </w:pPr>
-            <w:r/>
-            <w:r>
-              <w:rPr>
-                <w:b w:val="0"/>
-              </w:rPr>
-              <w:t>No usar: Q7 y QL (12%), Q8 (6% commodities), QT (triangular, de momento no se usa).</w:t>
-            </w:r>
-          </w:p>
-        </w:tc>
-        <w:tc>
-          <w:tcPr>
-            <w:tcW w:type="dxa" w:w="4876"/>
-          </w:tcPr>
-          <w:p>
-            <w:pPr>
-              <w:spacing w:after="0"/>
-            </w:pPr>
-            <w:r/>
-            <w:r>
-              <w:rPr>
-                <w:b w:val="0"/>
-              </w:rPr>
-              <w:t>—</w:t>
-            </w:r>
-          </w:p>
-        </w:tc>
-        <w:tc>
-          <w:tcPr>
-            <w:tcW w:type="dxa" w:w="4309"/>
+            <w:tcW w:type="dxa" w:w="4535"/>
           </w:tcPr>
           <w:p>
             <w:pPr>
@@ -1564,7 +1995,7 @@
         <w:t xml:space="preserve">Puntos a confirmar con el SSC: </w:t>
       </w:r>
       <w:r>
-        <w:t>(1) El manual indica que el 12% no es deducible y lo lista en Q7/QL "no usar", pero al mismo tiempo asigna restaurante/no deducible a Q0; esta guía lo recoge como Q0. (2) El manual no detalla QA–QH ni QT. (3) La sección "Foreign refundable VAT" del manual está vacía en el documento recibido.</w:t>
+        <w:t>(1) El manual indica que el 12% no es deducible y lo lista en Q7/QL "no usar", pero al mismo tiempo asigna restaurante/no deducible a Q0; esta guía lo deja en Q0 y marca Q7/QL como no usar. (2) El manual no detalla QA–QH ni QT. (3) La sección "Foreign refundable VAT" del manual está vacía en el documento recibido.</w:t>
       </w:r>
     </w:p>
     <w:sectPr>

</xml_diff>

<commit_message>
Group VAT codes by operation type: domestic, intra-EU, non-EU
Co-Authored-By: Claude Sonnet 5.5 <noreply@anthropic.com>
Claude-Session: https://claude.ai/code/session_01HwouEZMchCnSFLcjGwnegZ
</commit_message>
<xml_diff>
--- a/out/AP1311_Resumen_tax_codes_IVA_BE.docx
+++ b/out/AP1311_Resumen_tax_codes_IVA_BE.docx
@@ -114,6 +114,28 @@
       <w:tr>
         <w:tc>
           <w:tcPr>
+            <w:tcW w:type="dxa" w:w="15364"/>
+            <w:gridSpan w:val="4"/>
+            <w:shd w:val="clear" w:fill="DCE6F1"/>
+          </w:tcPr>
+          <w:p>
+            <w:pPr>
+              <w:spacing w:after="0"/>
+            </w:pPr>
+            <w:r/>
+            <w:r>
+              <w:rPr>
+                <w:b/>
+                <w:color w:val="1F3A5F"/>
+              </w:rPr>
+              <w:t>1. NACIONAL: proveedor belga (con NIF-IVA belga)</w:t>
+            </w:r>
+          </w:p>
+        </w:tc>
+      </w:tr>
+      <w:tr>
+        <w:tc>
+          <w:tcPr>
             <w:tcW w:type="dxa" w:w="1134"/>
             <w:shd w:val="clear" w:fill="F2F2F2"/>
           </w:tcPr>
@@ -161,17 +183,6 @@
                 <w:b w:val="0"/>
               </w:rPr>
               <w:t>Factura belga sin IVA o con IVA no deducible: vales de comida (Edenred), alquiler de edificios, seguros (incl. coches), extractos de tarjeta no BE (Barclays, Airplus), transporte 0 %, embalaje extra, leasing de bicicletas (O2O 1000029004), flores/regalos (Van Cauwenberge 1000016602, VDC Komerz 1000031901), restaurante (RSCA 1000016823).</w:t>
-            </w:r>
-          </w:p>
-          <w:p>
-            <w:pPr>
-              <w:spacing w:after="0"/>
-            </w:pPr>
-            <w:r>
-              <w:rPr>
-                <w:b w:val="0"/>
-              </w:rPr>
-              <w:t>Importación de bienes de fuera de la UE con documentos de aduana (p. ej. Simpson/Dawes, Ossett GB 1000030093): el SSC hace la autoliquidación manual con los documentos del broker (Mainfreight).</w:t>
             </w:r>
           </w:p>
         </w:tc>
@@ -301,77 +312,6 @@
               <w:rPr>
                 <w:b/>
               </w:rPr>
-              <w:t>Q2</w:t>
-            </w:r>
-          </w:p>
-        </w:tc>
-        <w:tc>
-          <w:tcPr>
-            <w:tcW w:type="dxa" w:w="3515"/>
-          </w:tcPr>
-          <w:p>
-            <w:pPr>
-              <w:spacing w:after="0"/>
-            </w:pPr>
-            <w:r/>
-            <w:r>
-              <w:rPr>
-                <w:b w:val="0"/>
-              </w:rPr>
-              <w:t>Importación de bienes: IVA de importación a pagar.</w:t>
-            </w:r>
-          </w:p>
-        </w:tc>
-        <w:tc>
-          <w:tcPr>
-            <w:tcW w:type="dxa" w:w="5783"/>
-          </w:tcPr>
-          <w:p>
-            <w:pPr>
-              <w:spacing w:after="0"/>
-            </w:pPr>
-            <w:r/>
-            <w:r>
-              <w:rPr>
-                <w:b w:val="0"/>
-              </w:rPr>
-              <w:t>Compra de bienes fuera de la UE declarada vía aduana (el valor lo fija aduana).</w:t>
-            </w:r>
-          </w:p>
-        </w:tc>
-        <w:tc>
-          <w:tcPr>
-            <w:tcW w:type="dxa" w:w="4535"/>
-          </w:tcPr>
-          <w:p>
-            <w:pPr>
-              <w:spacing w:after="0"/>
-            </w:pPr>
-            <w:r/>
-            <w:r>
-              <w:rPr>
-                <w:b w:val="0"/>
-              </w:rPr>
-              <w:t>NO se puede usar en ninguna factura. Estas facturas van con Q0.</w:t>
-            </w:r>
-          </w:p>
-        </w:tc>
-      </w:tr>
-      <w:tr>
-        <w:tc>
-          <w:tcPr>
-            <w:tcW w:type="dxa" w:w="1134"/>
-            <w:shd w:val="clear" w:fill="F2F2F2"/>
-          </w:tcPr>
-          <w:p>
-            <w:pPr>
-              <w:spacing w:after="0"/>
-            </w:pPr>
-            <w:r/>
-            <w:r>
-              <w:rPr>
-                <w:b/>
-              </w:rPr>
               <w:t>Q3</w:t>
             </w:r>
           </w:p>
@@ -424,6 +364,678 @@
                 <w:b w:val="0"/>
               </w:rPr>
               <w:t>Se usa sobre todo en asientos manuales y accruals.</w:t>
+            </w:r>
+          </w:p>
+        </w:tc>
+      </w:tr>
+      <w:tr>
+        <w:tc>
+          <w:tcPr>
+            <w:tcW w:type="dxa" w:w="1134"/>
+            <w:shd w:val="clear" w:fill="F2F2F2"/>
+          </w:tcPr>
+          <w:p>
+            <w:pPr>
+              <w:spacing w:after="0"/>
+            </w:pPr>
+            <w:r/>
+            <w:r>
+              <w:rPr>
+                <w:b/>
+              </w:rPr>
+              <w:t>Q7</w:t>
+            </w:r>
+          </w:p>
+        </w:tc>
+        <w:tc>
+          <w:tcPr>
+            <w:tcW w:type="dxa" w:w="3515"/>
+          </w:tcPr>
+          <w:p>
+            <w:pPr>
+              <w:spacing w:after="0"/>
+            </w:pPr>
+            <w:r/>
+            <w:r>
+              <w:rPr>
+                <w:b w:val="0"/>
+              </w:rPr>
+              <w:t>12 % bienes. NO USAR.</w:t>
+            </w:r>
+          </w:p>
+        </w:tc>
+        <w:tc>
+          <w:tcPr>
+            <w:tcW w:type="dxa" w:w="5783"/>
+          </w:tcPr>
+          <w:p>
+            <w:pPr>
+              <w:spacing w:after="0"/>
+            </w:pPr>
+            <w:r/>
+            <w:r>
+              <w:rPr>
+                <w:b w:val="0"/>
+              </w:rPr>
+              <w:t>12 % nunca es deducible (típico restaurante/catering con clientes).</w:t>
+            </w:r>
+          </w:p>
+        </w:tc>
+        <w:tc>
+          <w:tcPr>
+            <w:tcW w:type="dxa" w:w="4535"/>
+          </w:tcPr>
+          <w:p>
+            <w:pPr>
+              <w:spacing w:after="0"/>
+            </w:pPr>
+            <w:r/>
+            <w:r>
+              <w:rPr>
+                <w:b w:val="0"/>
+              </w:rPr>
+              <w:t>Ver Q0 para gastos no deducibles. (Pendiente confirmar con SSC.)</w:t>
+            </w:r>
+          </w:p>
+        </w:tc>
+      </w:tr>
+      <w:tr>
+        <w:tc>
+          <w:tcPr>
+            <w:tcW w:type="dxa" w:w="1134"/>
+            <w:shd w:val="clear" w:fill="F2F2F2"/>
+          </w:tcPr>
+          <w:p>
+            <w:pPr>
+              <w:spacing w:after="0"/>
+            </w:pPr>
+            <w:r/>
+            <w:r>
+              <w:rPr>
+                <w:b/>
+              </w:rPr>
+              <w:t>Q8</w:t>
+            </w:r>
+          </w:p>
+        </w:tc>
+        <w:tc>
+          <w:tcPr>
+            <w:tcW w:type="dxa" w:w="3515"/>
+          </w:tcPr>
+          <w:p>
+            <w:pPr>
+              <w:spacing w:after="0"/>
+            </w:pPr>
+            <w:r/>
+            <w:r>
+              <w:rPr>
+                <w:b w:val="0"/>
+              </w:rPr>
+              <w:t>6 % bienes (commodities). NO USAR.</w:t>
+            </w:r>
+          </w:p>
+        </w:tc>
+        <w:tc>
+          <w:tcPr>
+            <w:tcW w:type="dxa" w:w="5783"/>
+          </w:tcPr>
+          <w:p>
+            <w:pPr>
+              <w:spacing w:after="0"/>
+            </w:pPr>
+            <w:r/>
+            <w:r>
+              <w:rPr>
+                <w:b w:val="0"/>
+              </w:rPr>
+              <w:t>—</w:t>
+            </w:r>
+          </w:p>
+        </w:tc>
+        <w:tc>
+          <w:tcPr>
+            <w:tcW w:type="dxa" w:w="4535"/>
+          </w:tcPr>
+          <w:p>
+            <w:pPr>
+              <w:spacing w:after="0"/>
+            </w:pPr>
+            <w:r/>
+            <w:r>
+              <w:rPr>
+                <w:b w:val="0"/>
+              </w:rPr>
+              <w:t>No se usa en las sociedades belgas.</w:t>
+            </w:r>
+          </w:p>
+        </w:tc>
+      </w:tr>
+      <w:tr>
+        <w:tc>
+          <w:tcPr>
+            <w:tcW w:type="dxa" w:w="1134"/>
+            <w:shd w:val="clear" w:fill="F2F2F2"/>
+          </w:tcPr>
+          <w:p>
+            <w:pPr>
+              <w:spacing w:after="0"/>
+            </w:pPr>
+            <w:r/>
+            <w:r>
+              <w:rPr>
+                <w:b/>
+              </w:rPr>
+              <w:t>QA</w:t>
+            </w:r>
+          </w:p>
+        </w:tc>
+        <w:tc>
+          <w:tcPr>
+            <w:tcW w:type="dxa" w:w="3515"/>
+          </w:tcPr>
+          <w:p>
+            <w:pPr>
+              <w:spacing w:after="0"/>
+            </w:pPr>
+            <w:r/>
+            <w:r>
+              <w:rPr>
+                <w:b w:val="0"/>
+              </w:rPr>
+              <w:t>Sin %: regalos / uso privado (sin deducción).</w:t>
+            </w:r>
+          </w:p>
+        </w:tc>
+        <w:tc>
+          <w:tcPr>
+            <w:tcW w:type="dxa" w:w="5783"/>
+          </w:tcPr>
+          <w:p>
+            <w:pPr>
+              <w:spacing w:after="0"/>
+            </w:pPr>
+            <w:r/>
+            <w:r>
+              <w:rPr>
+                <w:b w:val="0"/>
+              </w:rPr>
+              <w:t>—</w:t>
+            </w:r>
+          </w:p>
+        </w:tc>
+        <w:tc>
+          <w:tcPr>
+            <w:tcW w:type="dxa" w:w="4535"/>
+          </w:tcPr>
+          <w:p>
+            <w:pPr>
+              <w:spacing w:after="0"/>
+            </w:pPr>
+            <w:r/>
+            <w:r>
+              <w:rPr>
+                <w:b w:val="0"/>
+              </w:rPr>
+              <w:t>Sin detalle en el manual.</w:t>
+            </w:r>
+          </w:p>
+        </w:tc>
+      </w:tr>
+      <w:tr>
+        <w:tc>
+          <w:tcPr>
+            <w:tcW w:type="dxa" w:w="1134"/>
+            <w:shd w:val="clear" w:fill="F2F2F2"/>
+          </w:tcPr>
+          <w:p>
+            <w:pPr>
+              <w:spacing w:after="0"/>
+            </w:pPr>
+            <w:r/>
+            <w:r>
+              <w:rPr>
+                <w:b/>
+              </w:rPr>
+              <w:t>QI</w:t>
+            </w:r>
+          </w:p>
+        </w:tc>
+        <w:tc>
+          <w:tcPr>
+            <w:tcW w:type="dxa" w:w="3515"/>
+          </w:tcPr>
+          <w:p>
+            <w:pPr>
+              <w:spacing w:after="0"/>
+            </w:pPr>
+            <w:r/>
+            <w:r>
+              <w:rPr>
+                <w:b w:val="0"/>
+              </w:rPr>
+              <w:t>21 % servicios, 65 % no deducible (35 % deducible).</w:t>
+            </w:r>
+          </w:p>
+        </w:tc>
+        <w:tc>
+          <w:tcPr>
+            <w:tcW w:type="dxa" w:w="5783"/>
+          </w:tcPr>
+          <w:p>
+            <w:pPr>
+              <w:spacing w:after="0"/>
+            </w:pPr>
+            <w:r/>
+            <w:r>
+              <w:rPr>
+                <w:b w:val="0"/>
+              </w:rPr>
+              <w:t>Leasing y gastos de coches de empresa (mantenimiento, combustible): KBC Autolease 1000003080, Alphabet 1000016478, AXUS/ALD 1000002716, Arval 1000027841.</w:t>
+            </w:r>
+          </w:p>
+        </w:tc>
+        <w:tc>
+          <w:tcPr>
+            <w:tcW w:type="dxa" w:w="4535"/>
+          </w:tcPr>
+          <w:p>
+            <w:pPr>
+              <w:spacing w:after="0"/>
+            </w:pPr>
+            <w:r/>
+            <w:r>
+              <w:rPr>
+                <w:b w:val="0"/>
+              </w:rPr>
+              <w:t>Aplica a todo coste ligado al coche de empresa.</w:t>
+            </w:r>
+          </w:p>
+        </w:tc>
+      </w:tr>
+      <w:tr>
+        <w:tc>
+          <w:tcPr>
+            <w:tcW w:type="dxa" w:w="1134"/>
+            <w:shd w:val="clear" w:fill="F2F2F2"/>
+          </w:tcPr>
+          <w:p>
+            <w:pPr>
+              <w:spacing w:after="0"/>
+            </w:pPr>
+            <w:r/>
+            <w:r>
+              <w:rPr>
+                <w:b/>
+              </w:rPr>
+              <w:t>QJ</w:t>
+            </w:r>
+          </w:p>
+        </w:tc>
+        <w:tc>
+          <w:tcPr>
+            <w:tcW w:type="dxa" w:w="3515"/>
+          </w:tcPr>
+          <w:p>
+            <w:pPr>
+              <w:spacing w:after="0"/>
+            </w:pPr>
+            <w:r/>
+            <w:r>
+              <w:rPr>
+                <w:b w:val="0"/>
+              </w:rPr>
+              <w:t>21 % servicios, 25 % no deducible (75 % deducible).</w:t>
+            </w:r>
+          </w:p>
+        </w:tc>
+        <w:tc>
+          <w:tcPr>
+            <w:tcW w:type="dxa" w:w="5783"/>
+          </w:tcPr>
+          <w:p>
+            <w:pPr>
+              <w:spacing w:after="0"/>
+            </w:pPr>
+            <w:r/>
+            <w:r>
+              <w:rPr>
+                <w:b w:val="0"/>
+              </w:rPr>
+              <w:t>Móviles: Proximus, cuenta GL 633010.</w:t>
+            </w:r>
+          </w:p>
+        </w:tc>
+        <w:tc>
+          <w:tcPr>
+            <w:tcW w:type="dxa" w:w="4535"/>
+          </w:tcPr>
+          <w:p>
+            <w:pPr>
+              <w:spacing w:after="0"/>
+            </w:pPr>
+            <w:r/>
+            <w:r>
+              <w:rPr>
+                <w:b w:val="0"/>
+              </w:rPr>
+              <w:t>Las facturas llegan con QJ: cambiar a QK si no es móvil (líneas fijas, internet).</w:t>
+            </w:r>
+          </w:p>
+        </w:tc>
+      </w:tr>
+      <w:tr>
+        <w:tc>
+          <w:tcPr>
+            <w:tcW w:type="dxa" w:w="1134"/>
+            <w:shd w:val="clear" w:fill="F2F2F2"/>
+          </w:tcPr>
+          <w:p>
+            <w:pPr>
+              <w:spacing w:after="0"/>
+            </w:pPr>
+            <w:r/>
+            <w:r>
+              <w:rPr>
+                <w:b/>
+              </w:rPr>
+              <w:t>QK</w:t>
+            </w:r>
+          </w:p>
+        </w:tc>
+        <w:tc>
+          <w:tcPr>
+            <w:tcW w:type="dxa" w:w="3515"/>
+          </w:tcPr>
+          <w:p>
+            <w:pPr>
+              <w:spacing w:after="0"/>
+            </w:pPr>
+            <w:r/>
+            <w:r>
+              <w:rPr>
+                <w:b w:val="0"/>
+              </w:rPr>
+              <w:t>21 % servicios y bienes diversos.</w:t>
+            </w:r>
+          </w:p>
+        </w:tc>
+        <w:tc>
+          <w:tcPr>
+            <w:tcW w:type="dxa" w:w="5783"/>
+          </w:tcPr>
+          <w:p>
+            <w:pPr>
+              <w:spacing w:after="0"/>
+            </w:pPr>
+            <w:r/>
+            <w:r>
+              <w:rPr>
+                <w:b w:val="0"/>
+              </w:rPr>
+              <w:t>Proveedor BE con 21 % de servicios o bienes diversos. PO Coupa 3000…: siempre QK.</w:t>
+            </w:r>
+          </w:p>
+        </w:tc>
+        <w:tc>
+          <w:tcPr>
+            <w:tcW w:type="dxa" w:w="4535"/>
+          </w:tcPr>
+          <w:p>
+            <w:pPr>
+              <w:spacing w:after="0"/>
+            </w:pPr>
+            <w:r/>
+            <w:r>
+              <w:rPr>
+                <w:b w:val="0"/>
+              </w:rPr>
+              <w:t>Único código de 21 % en DSSPM.</w:t>
+            </w:r>
+          </w:p>
+          <w:p>
+            <w:pPr>
+              <w:spacing w:after="0"/>
+            </w:pPr>
+            <w:r>
+              <w:rPr>
+                <w:b w:val="0"/>
+              </w:rPr>
+              <w:t>Si la PO es 45… manda la SAP Tax Table.</w:t>
+            </w:r>
+          </w:p>
+        </w:tc>
+      </w:tr>
+      <w:tr>
+        <w:tc>
+          <w:tcPr>
+            <w:tcW w:type="dxa" w:w="1134"/>
+            <w:shd w:val="clear" w:fill="F2F2F2"/>
+          </w:tcPr>
+          <w:p>
+            <w:pPr>
+              <w:spacing w:after="0"/>
+            </w:pPr>
+            <w:r/>
+            <w:r>
+              <w:rPr>
+                <w:b/>
+              </w:rPr>
+              <w:t>QL</w:t>
+            </w:r>
+          </w:p>
+        </w:tc>
+        <w:tc>
+          <w:tcPr>
+            <w:tcW w:type="dxa" w:w="3515"/>
+          </w:tcPr>
+          <w:p>
+            <w:pPr>
+              <w:spacing w:after="0"/>
+            </w:pPr>
+            <w:r/>
+            <w:r>
+              <w:rPr>
+                <w:b w:val="0"/>
+              </w:rPr>
+              <w:t>12 % servicios. NO USAR.</w:t>
+            </w:r>
+          </w:p>
+        </w:tc>
+        <w:tc>
+          <w:tcPr>
+            <w:tcW w:type="dxa" w:w="5783"/>
+          </w:tcPr>
+          <w:p>
+            <w:pPr>
+              <w:spacing w:after="0"/>
+            </w:pPr>
+            <w:r/>
+            <w:r>
+              <w:rPr>
+                <w:b w:val="0"/>
+              </w:rPr>
+              <w:t>—</w:t>
+            </w:r>
+          </w:p>
+        </w:tc>
+        <w:tc>
+          <w:tcPr>
+            <w:tcW w:type="dxa" w:w="4535"/>
+          </w:tcPr>
+          <w:p>
+            <w:pPr>
+              <w:spacing w:after="0"/>
+            </w:pPr>
+            <w:r/>
+            <w:r>
+              <w:rPr>
+                <w:b w:val="0"/>
+              </w:rPr>
+              <w:t>Ver Q7.</w:t>
+            </w:r>
+          </w:p>
+        </w:tc>
+      </w:tr>
+      <w:tr>
+        <w:tc>
+          <w:tcPr>
+            <w:tcW w:type="dxa" w:w="1134"/>
+            <w:shd w:val="clear" w:fill="F2F2F2"/>
+          </w:tcPr>
+          <w:p>
+            <w:pPr>
+              <w:spacing w:after="0"/>
+            </w:pPr>
+            <w:r/>
+            <w:r>
+              <w:rPr>
+                <w:b/>
+              </w:rPr>
+              <w:t>QM</w:t>
+            </w:r>
+          </w:p>
+        </w:tc>
+        <w:tc>
+          <w:tcPr>
+            <w:tcW w:type="dxa" w:w="3515"/>
+          </w:tcPr>
+          <w:p>
+            <w:pPr>
+              <w:spacing w:after="0"/>
+            </w:pPr>
+            <w:r/>
+            <w:r>
+              <w:rPr>
+                <w:b w:val="0"/>
+              </w:rPr>
+              <w:t>6 % servicios y bienes diversos.</w:t>
+            </w:r>
+          </w:p>
+        </w:tc>
+        <w:tc>
+          <w:tcPr>
+            <w:tcW w:type="dxa" w:w="5783"/>
+          </w:tcPr>
+          <w:p>
+            <w:pPr>
+              <w:spacing w:after="0"/>
+            </w:pPr>
+            <w:r/>
+            <w:r>
+              <w:rPr>
+                <w:b w:val="0"/>
+              </w:rPr>
+              <w:t>Agua de red (De Watergroep 1000016615, TMVW 1000016594), taxi, agua potable/refrescos/fruta, medicamentos, periódicos y libros.</w:t>
+            </w:r>
+          </w:p>
+        </w:tc>
+        <w:tc>
+          <w:tcPr>
+            <w:tcW w:type="dxa" w:w="4535"/>
+          </w:tcPr>
+          <w:p>
+            <w:pPr>
+              <w:spacing w:after="0"/>
+            </w:pPr>
+            <w:r/>
+            <w:r>
+              <w:rPr>
+                <w:b w:val="0"/>
+              </w:rPr>
+              <w:t>—</w:t>
+            </w:r>
+          </w:p>
+        </w:tc>
+      </w:tr>
+      <w:tr>
+        <w:tc>
+          <w:tcPr>
+            <w:tcW w:type="dxa" w:w="1134"/>
+            <w:shd w:val="clear" w:fill="F2F2F2"/>
+          </w:tcPr>
+          <w:p>
+            <w:pPr>
+              <w:spacing w:after="0"/>
+            </w:pPr>
+            <w:r/>
+            <w:r>
+              <w:rPr>
+                <w:b/>
+              </w:rPr>
+              <w:t>QN</w:t>
+            </w:r>
+          </w:p>
+        </w:tc>
+        <w:tc>
+          <w:tcPr>
+            <w:tcW w:type="dxa" w:w="3515"/>
+          </w:tcPr>
+          <w:p>
+            <w:pPr>
+              <w:spacing w:after="0"/>
+            </w:pPr>
+            <w:r/>
+            <w:r>
+              <w:rPr>
+                <w:b w:val="0"/>
+              </w:rPr>
+              <w:t>0 % servicios: autoliquidación local (obras en inmuebles/instalaciones).</w:t>
+            </w:r>
+          </w:p>
+        </w:tc>
+        <w:tc>
+          <w:tcPr>
+            <w:tcW w:type="dxa" w:w="5783"/>
+          </w:tcPr>
+          <w:p>
+            <w:pPr>
+              <w:spacing w:after="0"/>
+            </w:pPr>
+            <w:r/>
+            <w:r>
+              <w:rPr>
+                <w:b w:val="0"/>
+              </w:rPr>
+              <w:t>Contratista BE: no cobra IVA por art. 20 K.B. nº 1; suele indicar "BTW verlegd" / "reverse charge" (obligatorio mencionarlo). Limpieza de edificios, pintura, reparaciones y mantenimiento de máquinas.</w:t>
+            </w:r>
+          </w:p>
+        </w:tc>
+        <w:tc>
+          <w:tcPr>
+            <w:tcW w:type="dxa" w:w="4535"/>
+          </w:tcPr>
+          <w:p>
+            <w:pPr>
+              <w:spacing w:after="0"/>
+            </w:pPr>
+            <w:r/>
+            <w:r>
+              <w:rPr>
+                <w:b w:val="0"/>
+              </w:rPr>
+              <w:t>No confundir con servicios intracomunitarios (Q5): aquí el proveedor es belga con NIF-IVA BE.</w:t>
+            </w:r>
+          </w:p>
+        </w:tc>
+      </w:tr>
+      <w:tr>
+        <w:tc>
+          <w:tcPr>
+            <w:tcW w:type="dxa" w:w="15364"/>
+            <w:gridSpan w:val="4"/>
+            <w:shd w:val="clear" w:fill="DCE6F1"/>
+          </w:tcPr>
+          <w:p>
+            <w:pPr>
+              <w:spacing w:after="0"/>
+            </w:pPr>
+            <w:r/>
+            <w:r>
+              <w:rPr>
+                <w:b/>
+                <w:color w:val="1F3A5F"/>
+              </w:rPr>
+              <w:t>2. INTRACOMUNITARIO: proveedor de otro estado UE</w:t>
             </w:r>
           </w:p>
         </w:tc>
@@ -618,7 +1230,7 @@
               <w:rPr>
                 <w:b/>
               </w:rPr>
-              <w:t>Q6</w:t>
+              <w:t>QN</w:t>
             </w:r>
           </w:p>
         </w:tc>
@@ -635,7 +1247,7 @@
               <w:rPr>
                 <w:b w:val="0"/>
               </w:rPr>
-              <w:t>0 % servicios fuera de UE: autoliquidación (importación de servicios).</w:t>
+              <w:t>0 % servicios: autoliquidación local (proveedor UE que instala en Bélgica).</w:t>
             </w:r>
           </w:p>
         </w:tc>
@@ -652,7 +1264,7 @@
               <w:rPr>
                 <w:b w:val="0"/>
               </w:rPr>
-              <w:t>Proveedor de país no UE (CH, GB, TR…), normalmente sin IVA o con 0 %. Todo recharge de DS Smith UK (GB fuera de la UE desde 01/01/2021).</w:t>
+              <w:t>Proveedor UE que monta/instala en Bélgica y no se registra en BE: art. 194 Directiva IVA o mención "reverse charge". Normalmente activos fijos de importe alto.</w:t>
             </w:r>
           </w:p>
         </w:tc>
@@ -669,149 +1281,7 @@
               <w:rPr>
                 <w:b w:val="0"/>
               </w:rPr>
-              <w:t>Usar Q6, no Q5. Revisar el NIF-IVA y qué se entrega.</w:t>
-            </w:r>
-          </w:p>
-        </w:tc>
-      </w:tr>
-      <w:tr>
-        <w:tc>
-          <w:tcPr>
-            <w:tcW w:type="dxa" w:w="1134"/>
-            <w:shd w:val="clear" w:fill="F2F2F2"/>
-          </w:tcPr>
-          <w:p>
-            <w:pPr>
-              <w:spacing w:after="0"/>
-            </w:pPr>
-            <w:r/>
-            <w:r>
-              <w:rPr>
-                <w:b/>
-              </w:rPr>
-              <w:t>Q7</w:t>
-            </w:r>
-          </w:p>
-        </w:tc>
-        <w:tc>
-          <w:tcPr>
-            <w:tcW w:type="dxa" w:w="3515"/>
-          </w:tcPr>
-          <w:p>
-            <w:pPr>
-              <w:spacing w:after="0"/>
-            </w:pPr>
-            <w:r/>
-            <w:r>
-              <w:rPr>
-                <w:b w:val="0"/>
-              </w:rPr>
-              <w:t>12 % bienes. NO USAR.</w:t>
-            </w:r>
-          </w:p>
-        </w:tc>
-        <w:tc>
-          <w:tcPr>
-            <w:tcW w:type="dxa" w:w="5783"/>
-          </w:tcPr>
-          <w:p>
-            <w:pPr>
-              <w:spacing w:after="0"/>
-            </w:pPr>
-            <w:r/>
-            <w:r>
-              <w:rPr>
-                <w:b w:val="0"/>
-              </w:rPr>
-              <w:t>12 % nunca es deducible (típico restaurante/catering con clientes).</w:t>
-            </w:r>
-          </w:p>
-        </w:tc>
-        <w:tc>
-          <w:tcPr>
-            <w:tcW w:type="dxa" w:w="4535"/>
-          </w:tcPr>
-          <w:p>
-            <w:pPr>
-              <w:spacing w:after="0"/>
-            </w:pPr>
-            <w:r/>
-            <w:r>
-              <w:rPr>
-                <w:b w:val="0"/>
-              </w:rPr>
-              <w:t>Ver Q0 para gastos no deducibles. (Pendiente confirmar con SSC.)</w:t>
-            </w:r>
-          </w:p>
-        </w:tc>
-      </w:tr>
-      <w:tr>
-        <w:tc>
-          <w:tcPr>
-            <w:tcW w:type="dxa" w:w="1134"/>
-            <w:shd w:val="clear" w:fill="F2F2F2"/>
-          </w:tcPr>
-          <w:p>
-            <w:pPr>
-              <w:spacing w:after="0"/>
-            </w:pPr>
-            <w:r/>
-            <w:r>
-              <w:rPr>
-                <w:b/>
-              </w:rPr>
-              <w:t>Q8</w:t>
-            </w:r>
-          </w:p>
-        </w:tc>
-        <w:tc>
-          <w:tcPr>
-            <w:tcW w:type="dxa" w:w="3515"/>
-          </w:tcPr>
-          <w:p>
-            <w:pPr>
-              <w:spacing w:after="0"/>
-            </w:pPr>
-            <w:r/>
-            <w:r>
-              <w:rPr>
-                <w:b w:val="0"/>
-              </w:rPr>
-              <w:t>6 % bienes (commodities). NO USAR.</w:t>
-            </w:r>
-          </w:p>
-        </w:tc>
-        <w:tc>
-          <w:tcPr>
-            <w:tcW w:type="dxa" w:w="5783"/>
-          </w:tcPr>
-          <w:p>
-            <w:pPr>
-              <w:spacing w:after="0"/>
-            </w:pPr>
-            <w:r/>
-            <w:r>
-              <w:rPr>
-                <w:b w:val="0"/>
-              </w:rPr>
-              <w:t>—</w:t>
-            </w:r>
-          </w:p>
-        </w:tc>
-        <w:tc>
-          <w:tcPr>
-            <w:tcW w:type="dxa" w:w="4535"/>
-          </w:tcPr>
-          <w:p>
-            <w:pPr>
-              <w:spacing w:after="0"/>
-            </w:pPr>
-            <w:r/>
-            <w:r>
-              <w:rPr>
-                <w:b w:val="0"/>
-              </w:rPr>
-              <w:t>No se usa en las sociedades belgas.</w:t>
+              <w:t>No confundir con Q5; el proveedor no siempre cita el artículo: revisar si hay instalación.</w:t>
             </w:r>
           </w:p>
         </w:tc>
@@ -883,77 +1353,6 @@
                 <w:b w:val="0"/>
               </w:rPr>
               <w:t>Verify y el cockpit lo asignan automáticamente. Todas sus facturas, incluidos rebates.</w:t>
-            </w:r>
-          </w:p>
-        </w:tc>
-      </w:tr>
-      <w:tr>
-        <w:tc>
-          <w:tcPr>
-            <w:tcW w:type="dxa" w:w="1134"/>
-            <w:shd w:val="clear" w:fill="F2F2F2"/>
-          </w:tcPr>
-          <w:p>
-            <w:pPr>
-              <w:spacing w:after="0"/>
-            </w:pPr>
-            <w:r/>
-            <w:r>
-              <w:rPr>
-                <w:b/>
-              </w:rPr>
-              <w:t>QA</w:t>
-            </w:r>
-          </w:p>
-        </w:tc>
-        <w:tc>
-          <w:tcPr>
-            <w:tcW w:type="dxa" w:w="3515"/>
-          </w:tcPr>
-          <w:p>
-            <w:pPr>
-              <w:spacing w:after="0"/>
-            </w:pPr>
-            <w:r/>
-            <w:r>
-              <w:rPr>
-                <w:b w:val="0"/>
-              </w:rPr>
-              <w:t>Sin %: regalos / uso privado (sin deducción).</w:t>
-            </w:r>
-          </w:p>
-        </w:tc>
-        <w:tc>
-          <w:tcPr>
-            <w:tcW w:type="dxa" w:w="5783"/>
-          </w:tcPr>
-          <w:p>
-            <w:pPr>
-              <w:spacing w:after="0"/>
-            </w:pPr>
-            <w:r/>
-            <w:r>
-              <w:rPr>
-                <w:b w:val="0"/>
-              </w:rPr>
-              <w:t>—</w:t>
-            </w:r>
-          </w:p>
-        </w:tc>
-        <w:tc>
-          <w:tcPr>
-            <w:tcW w:type="dxa" w:w="4535"/>
-          </w:tcPr>
-          <w:p>
-            <w:pPr>
-              <w:spacing w:after="0"/>
-            </w:pPr>
-            <w:r/>
-            <w:r>
-              <w:rPr>
-                <w:b w:val="0"/>
-              </w:rPr>
-              <w:t>Sin detalle en el manual.</w:t>
             </w:r>
           </w:p>
         </w:tc>
@@ -1399,6 +1798,312 @@
               <w:rPr>
                 <w:b/>
               </w:rPr>
+              <w:t>QT</w:t>
+            </w:r>
+          </w:p>
+        </w:tc>
+        <w:tc>
+          <w:tcPr>
+            <w:tcW w:type="dxa" w:w="3515"/>
+          </w:tcPr>
+          <w:p>
+            <w:pPr>
+              <w:spacing w:after="0"/>
+            </w:pPr>
+            <w:r/>
+            <w:r>
+              <w:rPr>
+                <w:b w:val="0"/>
+              </w:rPr>
+              <w:t>Triangular, compra de bienes. NO USAR (de momento).</w:t>
+            </w:r>
+          </w:p>
+        </w:tc>
+        <w:tc>
+          <w:tcPr>
+            <w:tcW w:type="dxa" w:w="5783"/>
+          </w:tcPr>
+          <w:p>
+            <w:pPr>
+              <w:spacing w:after="0"/>
+            </w:pPr>
+            <w:r/>
+            <w:r>
+              <w:rPr>
+                <w:b w:val="0"/>
+              </w:rPr>
+              <w:t>—</w:t>
+            </w:r>
+          </w:p>
+        </w:tc>
+        <w:tc>
+          <w:tcPr>
+            <w:tcW w:type="dxa" w:w="4535"/>
+          </w:tcPr>
+          <w:p>
+            <w:pPr>
+              <w:spacing w:after="0"/>
+            </w:pPr>
+            <w:r/>
+            <w:r>
+              <w:rPr>
+                <w:b w:val="0"/>
+              </w:rPr>
+              <w:t>—</w:t>
+            </w:r>
+          </w:p>
+        </w:tc>
+      </w:tr>
+      <w:tr>
+        <w:tc>
+          <w:tcPr>
+            <w:tcW w:type="dxa" w:w="15364"/>
+            <w:gridSpan w:val="4"/>
+            <w:shd w:val="clear" w:fill="DCE6F1"/>
+          </w:tcPr>
+          <w:p>
+            <w:pPr>
+              <w:spacing w:after="0"/>
+            </w:pPr>
+            <w:r/>
+            <w:r>
+              <w:rPr>
+                <w:b/>
+                <w:color w:val="1F3A5F"/>
+              </w:rPr>
+              <w:t>3. FUERA DE LA UE: CH, GB (desde 01/01/2021), TR…</w:t>
+            </w:r>
+          </w:p>
+        </w:tc>
+      </w:tr>
+      <w:tr>
+        <w:tc>
+          <w:tcPr>
+            <w:tcW w:type="dxa" w:w="1134"/>
+            <w:shd w:val="clear" w:fill="F2F2F2"/>
+          </w:tcPr>
+          <w:p>
+            <w:pPr>
+              <w:spacing w:after="0"/>
+            </w:pPr>
+            <w:r/>
+            <w:r>
+              <w:rPr>
+                <w:b/>
+              </w:rPr>
+              <w:t>Q6</w:t>
+            </w:r>
+          </w:p>
+        </w:tc>
+        <w:tc>
+          <w:tcPr>
+            <w:tcW w:type="dxa" w:w="3515"/>
+          </w:tcPr>
+          <w:p>
+            <w:pPr>
+              <w:spacing w:after="0"/>
+            </w:pPr>
+            <w:r/>
+            <w:r>
+              <w:rPr>
+                <w:b w:val="0"/>
+              </w:rPr>
+              <w:t>0 % servicios fuera de UE: autoliquidación (importación de servicios).</w:t>
+            </w:r>
+          </w:p>
+        </w:tc>
+        <w:tc>
+          <w:tcPr>
+            <w:tcW w:type="dxa" w:w="5783"/>
+          </w:tcPr>
+          <w:p>
+            <w:pPr>
+              <w:spacing w:after="0"/>
+            </w:pPr>
+            <w:r/>
+            <w:r>
+              <w:rPr>
+                <w:b w:val="0"/>
+              </w:rPr>
+              <w:t>Proveedor de país no UE (CH, GB, TR…), normalmente sin IVA o con 0 %. Todo recharge de DS Smith UK (GB fuera de la UE desde 01/01/2021).</w:t>
+            </w:r>
+          </w:p>
+        </w:tc>
+        <w:tc>
+          <w:tcPr>
+            <w:tcW w:type="dxa" w:w="4535"/>
+          </w:tcPr>
+          <w:p>
+            <w:pPr>
+              <w:spacing w:after="0"/>
+            </w:pPr>
+            <w:r/>
+            <w:r>
+              <w:rPr>
+                <w:b w:val="0"/>
+              </w:rPr>
+              <w:t>Usar Q6, no Q5. Revisar el NIF-IVA y qué se entrega.</w:t>
+            </w:r>
+          </w:p>
+        </w:tc>
+      </w:tr>
+      <w:tr>
+        <w:tc>
+          <w:tcPr>
+            <w:tcW w:type="dxa" w:w="1134"/>
+            <w:shd w:val="clear" w:fill="F2F2F2"/>
+          </w:tcPr>
+          <w:p>
+            <w:pPr>
+              <w:spacing w:after="0"/>
+            </w:pPr>
+            <w:r/>
+            <w:r>
+              <w:rPr>
+                <w:b/>
+              </w:rPr>
+              <w:t>Q0 (importación de bienes)</w:t>
+            </w:r>
+          </w:p>
+        </w:tc>
+        <w:tc>
+          <w:tcPr>
+            <w:tcW w:type="dxa" w:w="3515"/>
+          </w:tcPr>
+          <w:p>
+            <w:pPr>
+              <w:spacing w:after="0"/>
+            </w:pPr>
+            <w:r/>
+            <w:r>
+              <w:rPr>
+                <w:b w:val="0"/>
+              </w:rPr>
+              <w:t>0 % importación de bienes de fuera de la UE (con documentos de aduana). Entra en la declaración de IVA.</w:t>
+            </w:r>
+          </w:p>
+        </w:tc>
+        <w:tc>
+          <w:tcPr>
+            <w:tcW w:type="dxa" w:w="5783"/>
+          </w:tcPr>
+          <w:p>
+            <w:pPr>
+              <w:spacing w:after="0"/>
+            </w:pPr>
+            <w:r/>
+            <w:r>
+              <w:rPr>
+                <w:b w:val="0"/>
+              </w:rPr>
+              <w:t>Factura de bienes de fuera de la UE con declaración de aduana (p. ej. Simpson/Dawes, Ossett GB 1000030093). El SSC hace la autoliquidación manual con los documentos del broker (Mainfreight).</w:t>
+            </w:r>
+          </w:p>
+        </w:tc>
+        <w:tc>
+          <w:tcPr>
+            <w:tcW w:type="dxa" w:w="4535"/>
+          </w:tcPr>
+          <w:p>
+            <w:pPr>
+              <w:spacing w:after="0"/>
+            </w:pPr>
+            <w:r/>
+            <w:r>
+              <w:rPr>
+                <w:b w:val="0"/>
+              </w:rPr>
+              <w:t>Se contabiliza con Q0, no con Q2.</w:t>
+            </w:r>
+          </w:p>
+        </w:tc>
+      </w:tr>
+      <w:tr>
+        <w:tc>
+          <w:tcPr>
+            <w:tcW w:type="dxa" w:w="1134"/>
+            <w:shd w:val="clear" w:fill="F2F2F2"/>
+          </w:tcPr>
+          <w:p>
+            <w:pPr>
+              <w:spacing w:after="0"/>
+            </w:pPr>
+            <w:r/>
+            <w:r>
+              <w:rPr>
+                <w:b/>
+              </w:rPr>
+              <w:t>Q2</w:t>
+            </w:r>
+          </w:p>
+        </w:tc>
+        <w:tc>
+          <w:tcPr>
+            <w:tcW w:type="dxa" w:w="3515"/>
+          </w:tcPr>
+          <w:p>
+            <w:pPr>
+              <w:spacing w:after="0"/>
+            </w:pPr>
+            <w:r/>
+            <w:r>
+              <w:rPr>
+                <w:b w:val="0"/>
+              </w:rPr>
+              <w:t>Importación de bienes: IVA de importación a pagar.</w:t>
+            </w:r>
+          </w:p>
+        </w:tc>
+        <w:tc>
+          <w:tcPr>
+            <w:tcW w:type="dxa" w:w="5783"/>
+          </w:tcPr>
+          <w:p>
+            <w:pPr>
+              <w:spacing w:after="0"/>
+            </w:pPr>
+            <w:r/>
+            <w:r>
+              <w:rPr>
+                <w:b w:val="0"/>
+              </w:rPr>
+              <w:t>Compra de bienes fuera de la UE declarada vía aduana (el valor lo fija aduana).</w:t>
+            </w:r>
+          </w:p>
+        </w:tc>
+        <w:tc>
+          <w:tcPr>
+            <w:tcW w:type="dxa" w:w="4535"/>
+          </w:tcPr>
+          <w:p>
+            <w:pPr>
+              <w:spacing w:after="0"/>
+            </w:pPr>
+            <w:r/>
+            <w:r>
+              <w:rPr>
+                <w:b w:val="0"/>
+              </w:rPr>
+              <w:t>NO se puede usar en ninguna factura. Estas facturas van con Q0.</w:t>
+            </w:r>
+          </w:p>
+        </w:tc>
+      </w:tr>
+      <w:tr>
+        <w:tc>
+          <w:tcPr>
+            <w:tcW w:type="dxa" w:w="1134"/>
+            <w:shd w:val="clear" w:fill="F2F2F2"/>
+          </w:tcPr>
+          <w:p>
+            <w:pPr>
+              <w:spacing w:after="0"/>
+            </w:pPr>
+            <w:r/>
+            <w:r>
+              <w:rPr>
+                <w:b/>
+              </w:rPr>
               <w:t>QH</w:t>
             </w:r>
           </w:p>
@@ -1451,536 +2156,6 @@
                 <w:b w:val="0"/>
               </w:rPr>
               <w:t>Sin detalle en el manual.</w:t>
-            </w:r>
-          </w:p>
-        </w:tc>
-      </w:tr>
-      <w:tr>
-        <w:tc>
-          <w:tcPr>
-            <w:tcW w:type="dxa" w:w="1134"/>
-            <w:shd w:val="clear" w:fill="F2F2F2"/>
-          </w:tcPr>
-          <w:p>
-            <w:pPr>
-              <w:spacing w:after="0"/>
-            </w:pPr>
-            <w:r/>
-            <w:r>
-              <w:rPr>
-                <w:b/>
-              </w:rPr>
-              <w:t>QI</w:t>
-            </w:r>
-          </w:p>
-        </w:tc>
-        <w:tc>
-          <w:tcPr>
-            <w:tcW w:type="dxa" w:w="3515"/>
-          </w:tcPr>
-          <w:p>
-            <w:pPr>
-              <w:spacing w:after="0"/>
-            </w:pPr>
-            <w:r/>
-            <w:r>
-              <w:rPr>
-                <w:b w:val="0"/>
-              </w:rPr>
-              <w:t>21 % servicios, 65 % no deducible (35 % deducible).</w:t>
-            </w:r>
-          </w:p>
-        </w:tc>
-        <w:tc>
-          <w:tcPr>
-            <w:tcW w:type="dxa" w:w="5783"/>
-          </w:tcPr>
-          <w:p>
-            <w:pPr>
-              <w:spacing w:after="0"/>
-            </w:pPr>
-            <w:r/>
-            <w:r>
-              <w:rPr>
-                <w:b w:val="0"/>
-              </w:rPr>
-              <w:t>Leasing y gastos de coches de empresa (mantenimiento, combustible): KBC Autolease 1000003080, Alphabet 1000016478, AXUS/ALD 1000002716, Arval 1000027841.</w:t>
-            </w:r>
-          </w:p>
-        </w:tc>
-        <w:tc>
-          <w:tcPr>
-            <w:tcW w:type="dxa" w:w="4535"/>
-          </w:tcPr>
-          <w:p>
-            <w:pPr>
-              <w:spacing w:after="0"/>
-            </w:pPr>
-            <w:r/>
-            <w:r>
-              <w:rPr>
-                <w:b w:val="0"/>
-              </w:rPr>
-              <w:t>Aplica a todo coste ligado al coche de empresa.</w:t>
-            </w:r>
-          </w:p>
-        </w:tc>
-      </w:tr>
-      <w:tr>
-        <w:tc>
-          <w:tcPr>
-            <w:tcW w:type="dxa" w:w="1134"/>
-            <w:shd w:val="clear" w:fill="F2F2F2"/>
-          </w:tcPr>
-          <w:p>
-            <w:pPr>
-              <w:spacing w:after="0"/>
-            </w:pPr>
-            <w:r/>
-            <w:r>
-              <w:rPr>
-                <w:b/>
-              </w:rPr>
-              <w:t>QJ</w:t>
-            </w:r>
-          </w:p>
-        </w:tc>
-        <w:tc>
-          <w:tcPr>
-            <w:tcW w:type="dxa" w:w="3515"/>
-          </w:tcPr>
-          <w:p>
-            <w:pPr>
-              <w:spacing w:after="0"/>
-            </w:pPr>
-            <w:r/>
-            <w:r>
-              <w:rPr>
-                <w:b w:val="0"/>
-              </w:rPr>
-              <w:t>21 % servicios, 25 % no deducible (75 % deducible).</w:t>
-            </w:r>
-          </w:p>
-        </w:tc>
-        <w:tc>
-          <w:tcPr>
-            <w:tcW w:type="dxa" w:w="5783"/>
-          </w:tcPr>
-          <w:p>
-            <w:pPr>
-              <w:spacing w:after="0"/>
-            </w:pPr>
-            <w:r/>
-            <w:r>
-              <w:rPr>
-                <w:b w:val="0"/>
-              </w:rPr>
-              <w:t>Móviles: Proximus, cuenta GL 633010.</w:t>
-            </w:r>
-          </w:p>
-        </w:tc>
-        <w:tc>
-          <w:tcPr>
-            <w:tcW w:type="dxa" w:w="4535"/>
-          </w:tcPr>
-          <w:p>
-            <w:pPr>
-              <w:spacing w:after="0"/>
-            </w:pPr>
-            <w:r/>
-            <w:r>
-              <w:rPr>
-                <w:b w:val="0"/>
-              </w:rPr>
-              <w:t>Las facturas llegan con QJ: cambiar a QK si no es móvil (líneas fijas, internet).</w:t>
-            </w:r>
-          </w:p>
-        </w:tc>
-      </w:tr>
-      <w:tr>
-        <w:tc>
-          <w:tcPr>
-            <w:tcW w:type="dxa" w:w="1134"/>
-            <w:shd w:val="clear" w:fill="F2F2F2"/>
-          </w:tcPr>
-          <w:p>
-            <w:pPr>
-              <w:spacing w:after="0"/>
-            </w:pPr>
-            <w:r/>
-            <w:r>
-              <w:rPr>
-                <w:b/>
-              </w:rPr>
-              <w:t>QK</w:t>
-            </w:r>
-          </w:p>
-        </w:tc>
-        <w:tc>
-          <w:tcPr>
-            <w:tcW w:type="dxa" w:w="3515"/>
-          </w:tcPr>
-          <w:p>
-            <w:pPr>
-              <w:spacing w:after="0"/>
-            </w:pPr>
-            <w:r/>
-            <w:r>
-              <w:rPr>
-                <w:b w:val="0"/>
-              </w:rPr>
-              <w:t>21 % servicios y bienes diversos.</w:t>
-            </w:r>
-          </w:p>
-        </w:tc>
-        <w:tc>
-          <w:tcPr>
-            <w:tcW w:type="dxa" w:w="5783"/>
-          </w:tcPr>
-          <w:p>
-            <w:pPr>
-              <w:spacing w:after="0"/>
-            </w:pPr>
-            <w:r/>
-            <w:r>
-              <w:rPr>
-                <w:b w:val="0"/>
-              </w:rPr>
-              <w:t>Proveedor BE con 21 % de servicios o bienes diversos. PO Coupa 3000…: siempre QK.</w:t>
-            </w:r>
-          </w:p>
-        </w:tc>
-        <w:tc>
-          <w:tcPr>
-            <w:tcW w:type="dxa" w:w="4535"/>
-          </w:tcPr>
-          <w:p>
-            <w:pPr>
-              <w:spacing w:after="0"/>
-            </w:pPr>
-            <w:r/>
-            <w:r>
-              <w:rPr>
-                <w:b w:val="0"/>
-              </w:rPr>
-              <w:t>Único código de 21 % en DSSPM.</w:t>
-            </w:r>
-          </w:p>
-          <w:p>
-            <w:pPr>
-              <w:spacing w:after="0"/>
-            </w:pPr>
-            <w:r>
-              <w:rPr>
-                <w:b w:val="0"/>
-              </w:rPr>
-              <w:t>Si la PO es 45… manda la SAP Tax Table.</w:t>
-            </w:r>
-          </w:p>
-        </w:tc>
-      </w:tr>
-      <w:tr>
-        <w:tc>
-          <w:tcPr>
-            <w:tcW w:type="dxa" w:w="1134"/>
-            <w:shd w:val="clear" w:fill="F2F2F2"/>
-          </w:tcPr>
-          <w:p>
-            <w:pPr>
-              <w:spacing w:after="0"/>
-            </w:pPr>
-            <w:r/>
-            <w:r>
-              <w:rPr>
-                <w:b/>
-              </w:rPr>
-              <w:t>QL</w:t>
-            </w:r>
-          </w:p>
-        </w:tc>
-        <w:tc>
-          <w:tcPr>
-            <w:tcW w:type="dxa" w:w="3515"/>
-          </w:tcPr>
-          <w:p>
-            <w:pPr>
-              <w:spacing w:after="0"/>
-            </w:pPr>
-            <w:r/>
-            <w:r>
-              <w:rPr>
-                <w:b w:val="0"/>
-              </w:rPr>
-              <w:t>12 % servicios. NO USAR.</w:t>
-            </w:r>
-          </w:p>
-        </w:tc>
-        <w:tc>
-          <w:tcPr>
-            <w:tcW w:type="dxa" w:w="5783"/>
-          </w:tcPr>
-          <w:p>
-            <w:pPr>
-              <w:spacing w:after="0"/>
-            </w:pPr>
-            <w:r/>
-            <w:r>
-              <w:rPr>
-                <w:b w:val="0"/>
-              </w:rPr>
-              <w:t>—</w:t>
-            </w:r>
-          </w:p>
-        </w:tc>
-        <w:tc>
-          <w:tcPr>
-            <w:tcW w:type="dxa" w:w="4535"/>
-          </w:tcPr>
-          <w:p>
-            <w:pPr>
-              <w:spacing w:after="0"/>
-            </w:pPr>
-            <w:r/>
-            <w:r>
-              <w:rPr>
-                <w:b w:val="0"/>
-              </w:rPr>
-              <w:t>Ver Q7.</w:t>
-            </w:r>
-          </w:p>
-        </w:tc>
-      </w:tr>
-      <w:tr>
-        <w:tc>
-          <w:tcPr>
-            <w:tcW w:type="dxa" w:w="1134"/>
-            <w:shd w:val="clear" w:fill="F2F2F2"/>
-          </w:tcPr>
-          <w:p>
-            <w:pPr>
-              <w:spacing w:after="0"/>
-            </w:pPr>
-            <w:r/>
-            <w:r>
-              <w:rPr>
-                <w:b/>
-              </w:rPr>
-              <w:t>QM</w:t>
-            </w:r>
-          </w:p>
-        </w:tc>
-        <w:tc>
-          <w:tcPr>
-            <w:tcW w:type="dxa" w:w="3515"/>
-          </w:tcPr>
-          <w:p>
-            <w:pPr>
-              <w:spacing w:after="0"/>
-            </w:pPr>
-            <w:r/>
-            <w:r>
-              <w:rPr>
-                <w:b w:val="0"/>
-              </w:rPr>
-              <w:t>6 % servicios y bienes diversos.</w:t>
-            </w:r>
-          </w:p>
-        </w:tc>
-        <w:tc>
-          <w:tcPr>
-            <w:tcW w:type="dxa" w:w="5783"/>
-          </w:tcPr>
-          <w:p>
-            <w:pPr>
-              <w:spacing w:after="0"/>
-            </w:pPr>
-            <w:r/>
-            <w:r>
-              <w:rPr>
-                <w:b w:val="0"/>
-              </w:rPr>
-              <w:t>Agua de red (De Watergroep 1000016615, TMVW 1000016594), taxi, agua potable/refrescos/fruta, medicamentos, periódicos y libros.</w:t>
-            </w:r>
-          </w:p>
-        </w:tc>
-        <w:tc>
-          <w:tcPr>
-            <w:tcW w:type="dxa" w:w="4535"/>
-          </w:tcPr>
-          <w:p>
-            <w:pPr>
-              <w:spacing w:after="0"/>
-            </w:pPr>
-            <w:r/>
-            <w:r>
-              <w:rPr>
-                <w:b w:val="0"/>
-              </w:rPr>
-              <w:t>—</w:t>
-            </w:r>
-          </w:p>
-        </w:tc>
-      </w:tr>
-      <w:tr>
-        <w:tc>
-          <w:tcPr>
-            <w:tcW w:type="dxa" w:w="1134"/>
-            <w:shd w:val="clear" w:fill="F2F2F2"/>
-          </w:tcPr>
-          <w:p>
-            <w:pPr>
-              <w:spacing w:after="0"/>
-            </w:pPr>
-            <w:r/>
-            <w:r>
-              <w:rPr>
-                <w:b/>
-              </w:rPr>
-              <w:t>QN</w:t>
-            </w:r>
-          </w:p>
-        </w:tc>
-        <w:tc>
-          <w:tcPr>
-            <w:tcW w:type="dxa" w:w="3515"/>
-          </w:tcPr>
-          <w:p>
-            <w:pPr>
-              <w:spacing w:after="0"/>
-            </w:pPr>
-            <w:r/>
-            <w:r>
-              <w:rPr>
-                <w:b w:val="0"/>
-              </w:rPr>
-              <w:t>0 % servicios: autoliquidación local (obras en inmuebles/instalaciones).</w:t>
-            </w:r>
-          </w:p>
-        </w:tc>
-        <w:tc>
-          <w:tcPr>
-            <w:tcW w:type="dxa" w:w="5783"/>
-          </w:tcPr>
-          <w:p>
-            <w:pPr>
-              <w:spacing w:after="0"/>
-            </w:pPr>
-            <w:r/>
-            <w:r>
-              <w:rPr>
-                <w:b w:val="0"/>
-              </w:rPr>
-              <w:t>Contratista BE: no cobra IVA por art. 20 K.B. nº 1; suele indicar "BTW verlegd" / "reverse charge" (obligatorio mencionarlo). Limpieza de edificios, pintura, reparaciones y mantenimiento de máquinas.</w:t>
-            </w:r>
-          </w:p>
-          <w:p>
-            <w:pPr>
-              <w:spacing w:after="0"/>
-            </w:pPr>
-            <w:r>
-              <w:rPr>
-                <w:b w:val="0"/>
-              </w:rPr>
-              <w:t>Proveedor UE que instala en Bélgica: art. 194 Directiva IVA (normalmente activos fijos de importe alto).</w:t>
-            </w:r>
-          </w:p>
-        </w:tc>
-        <w:tc>
-          <w:tcPr>
-            <w:tcW w:type="dxa" w:w="4535"/>
-          </w:tcPr>
-          <w:p>
-            <w:pPr>
-              <w:spacing w:after="0"/>
-            </w:pPr>
-            <w:r/>
-            <w:r>
-              <w:rPr>
-                <w:b w:val="0"/>
-              </w:rPr>
-              <w:t>Solo UE, no existe fuera de la UE.</w:t>
-            </w:r>
-          </w:p>
-          <w:p>
-            <w:pPr>
-              <w:spacing w:after="0"/>
-            </w:pPr>
-            <w:r>
-              <w:rPr>
-                <w:b w:val="0"/>
-              </w:rPr>
-              <w:t>No confundir con Q5; el proveedor no siempre cita el artículo: revisar si hay instalación.</w:t>
-            </w:r>
-          </w:p>
-        </w:tc>
-      </w:tr>
-      <w:tr>
-        <w:tc>
-          <w:tcPr>
-            <w:tcW w:type="dxa" w:w="1134"/>
-            <w:shd w:val="clear" w:fill="F2F2F2"/>
-          </w:tcPr>
-          <w:p>
-            <w:pPr>
-              <w:spacing w:after="0"/>
-            </w:pPr>
-            <w:r/>
-            <w:r>
-              <w:rPr>
-                <w:b/>
-              </w:rPr>
-              <w:t>QT</w:t>
-            </w:r>
-          </w:p>
-        </w:tc>
-        <w:tc>
-          <w:tcPr>
-            <w:tcW w:type="dxa" w:w="3515"/>
-          </w:tcPr>
-          <w:p>
-            <w:pPr>
-              <w:spacing w:after="0"/>
-            </w:pPr>
-            <w:r/>
-            <w:r>
-              <w:rPr>
-                <w:b w:val="0"/>
-              </w:rPr>
-              <w:t>Triangular, compra de bienes. NO USAR (de momento).</w:t>
-            </w:r>
-          </w:p>
-        </w:tc>
-        <w:tc>
-          <w:tcPr>
-            <w:tcW w:type="dxa" w:w="5783"/>
-          </w:tcPr>
-          <w:p>
-            <w:pPr>
-              <w:spacing w:after="0"/>
-            </w:pPr>
-            <w:r/>
-            <w:r>
-              <w:rPr>
-                <w:b w:val="0"/>
-              </w:rPr>
-              <w:t>—</w:t>
-            </w:r>
-          </w:p>
-        </w:tc>
-        <w:tc>
-          <w:tcPr>
-            <w:tcW w:type="dxa" w:w="4535"/>
-          </w:tcPr>
-          <w:p>
-            <w:pPr>
-              <w:spacing w:after="0"/>
-            </w:pPr>
-            <w:r/>
-            <w:r>
-              <w:rPr>
-                <w:b w:val="0"/>
-              </w:rPr>
-              <w:t>—</w:t>
             </w:r>
           </w:p>
         </w:tc>

</xml_diff>

<commit_message>
Order VAT codes within each category as in the manual
Co-Authored-By: Claude Sonnet 5.5 <noreply@anthropic.com>
Claude-Session: https://claude.ai/code/session_01HwouEZMchCnSFLcjGwnegZ
</commit_message>
<xml_diff>
--- a/out/AP1311_Resumen_tax_codes_IVA_BE.docx
+++ b/out/AP1311_Resumen_tax_codes_IVA_BE.docx
@@ -230,6 +230,77 @@
               <w:rPr>
                 <w:b/>
               </w:rPr>
+              <w:t>Q3</w:t>
+            </w:r>
+          </w:p>
+        </w:tc>
+        <w:tc>
+          <w:tcPr>
+            <w:tcW w:type="dxa" w:w="3515"/>
+          </w:tcPr>
+          <w:p>
+            <w:pPr>
+              <w:spacing w:after="0"/>
+            </w:pPr>
+            <w:r/>
+            <w:r>
+              <w:rPr>
+                <w:b w:val="0"/>
+              </w:rPr>
+              <w:t>Fuera del ámbito del IVA (sin %, sin efecto en la declaración).</w:t>
+            </w:r>
+          </w:p>
+        </w:tc>
+        <w:tc>
+          <w:tcPr>
+            <w:tcW w:type="dxa" w:w="5783"/>
+          </w:tcPr>
+          <w:p>
+            <w:pPr>
+              <w:spacing w:after="0"/>
+            </w:pPr>
+            <w:r/>
+            <w:r>
+              <w:rPr>
+                <w:b w:val="0"/>
+              </w:rPr>
+              <w:t>Cargos sociales (SD Worx) e impuestos. En facturas de SD Worx: parte administrativa con IVA BE y cargos sociales con Q3.</w:t>
+            </w:r>
+          </w:p>
+        </w:tc>
+        <w:tc>
+          <w:tcPr>
+            <w:tcW w:type="dxa" w:w="4535"/>
+          </w:tcPr>
+          <w:p>
+            <w:pPr>
+              <w:spacing w:after="0"/>
+            </w:pPr>
+            <w:r/>
+            <w:r>
+              <w:rPr>
+                <w:b w:val="0"/>
+              </w:rPr>
+              <w:t>Se usa sobre todo en asientos manuales y accruals.</w:t>
+            </w:r>
+          </w:p>
+        </w:tc>
+      </w:tr>
+      <w:tr>
+        <w:tc>
+          <w:tcPr>
+            <w:tcW w:type="dxa" w:w="1134"/>
+            <w:shd w:val="clear" w:fill="F2F2F2"/>
+          </w:tcPr>
+          <w:p>
+            <w:pPr>
+              <w:spacing w:after="0"/>
+            </w:pPr>
+            <w:r/>
+            <w:r>
+              <w:rPr>
+                <w:b/>
+              </w:rPr>
               <w:t>Q1</w:t>
             </w:r>
           </w:p>
@@ -312,7 +383,7 @@
               <w:rPr>
                 <w:b/>
               </w:rPr>
-              <w:t>Q3</w:t>
+              <w:t>QK</w:t>
             </w:r>
           </w:p>
         </w:tc>
@@ -329,7 +400,7 @@
               <w:rPr>
                 <w:b w:val="0"/>
               </w:rPr>
-              <w:t>Fuera del ámbito del IVA (sin %, sin efecto en la declaración).</w:t>
+              <w:t>21 % servicios y bienes diversos.</w:t>
             </w:r>
           </w:p>
         </w:tc>
@@ -346,7 +417,7 @@
               <w:rPr>
                 <w:b w:val="0"/>
               </w:rPr>
-              <w:t>Cargos sociales (SD Worx) e impuestos. En facturas de SD Worx: parte administrativa con IVA BE y cargos sociales con Q3.</w:t>
+              <w:t>Proveedor BE con 21 % de servicios o bienes diversos. PO Coupa 3000…: siempre QK.</w:t>
             </w:r>
           </w:p>
         </w:tc>
@@ -363,78 +434,18 @@
               <w:rPr>
                 <w:b w:val="0"/>
               </w:rPr>
-              <w:t>Se usa sobre todo en asientos manuales y accruals.</w:t>
+              <w:t>Único código de 21 % en DSSPM.</w:t>
             </w:r>
           </w:p>
-        </w:tc>
-      </w:tr>
-      <w:tr>
-        <w:tc>
-          <w:tcPr>
-            <w:tcW w:type="dxa" w:w="1134"/>
-            <w:shd w:val="clear" w:fill="F2F2F2"/>
-          </w:tcPr>
           <w:p>
             <w:pPr>
               <w:spacing w:after="0"/>
             </w:pPr>
-            <w:r/>
-            <w:r>
-              <w:rPr>
-                <w:b/>
-              </w:rPr>
-              <w:t>Q7</w:t>
-            </w:r>
-          </w:p>
-        </w:tc>
-        <w:tc>
-          <w:tcPr>
-            <w:tcW w:type="dxa" w:w="3515"/>
-          </w:tcPr>
-          <w:p>
-            <w:pPr>
-              <w:spacing w:after="0"/>
-            </w:pPr>
-            <w:r/>
             <w:r>
               <w:rPr>
                 <w:b w:val="0"/>
               </w:rPr>
-              <w:t>12 % bienes. NO USAR.</w:t>
-            </w:r>
-          </w:p>
-        </w:tc>
-        <w:tc>
-          <w:tcPr>
-            <w:tcW w:type="dxa" w:w="5783"/>
-          </w:tcPr>
-          <w:p>
-            <w:pPr>
-              <w:spacing w:after="0"/>
-            </w:pPr>
-            <w:r/>
-            <w:r>
-              <w:rPr>
-                <w:b w:val="0"/>
-              </w:rPr>
-              <w:t>12 % nunca es deducible (típico restaurante/catering con clientes).</w:t>
-            </w:r>
-          </w:p>
-        </w:tc>
-        <w:tc>
-          <w:tcPr>
-            <w:tcW w:type="dxa" w:w="4535"/>
-          </w:tcPr>
-          <w:p>
-            <w:pPr>
-              <w:spacing w:after="0"/>
-            </w:pPr>
-            <w:r/>
-            <w:r>
-              <w:rPr>
-                <w:b w:val="0"/>
-              </w:rPr>
-              <w:t>Ver Q0 para gastos no deducibles. (Pendiente confirmar con SSC.)</w:t>
+              <w:t>Si la PO es 45… manda la SAP Tax Table.</w:t>
             </w:r>
           </w:p>
         </w:tc>
@@ -525,7 +536,7 @@
               <w:rPr>
                 <w:b/>
               </w:rPr>
-              <w:t>QA</w:t>
+              <w:t>QM</w:t>
             </w:r>
           </w:p>
         </w:tc>
@@ -542,7 +553,78 @@
               <w:rPr>
                 <w:b w:val="0"/>
               </w:rPr>
-              <w:t>Sin %: regalos / uso privado (sin deducción).</w:t>
+              <w:t>6 % servicios y bienes diversos.</w:t>
+            </w:r>
+          </w:p>
+        </w:tc>
+        <w:tc>
+          <w:tcPr>
+            <w:tcW w:type="dxa" w:w="5783"/>
+          </w:tcPr>
+          <w:p>
+            <w:pPr>
+              <w:spacing w:after="0"/>
+            </w:pPr>
+            <w:r/>
+            <w:r>
+              <w:rPr>
+                <w:b w:val="0"/>
+              </w:rPr>
+              <w:t>Agua de red (De Watergroep 1000016615, TMVW 1000016594), taxi, agua potable/refrescos/fruta, medicamentos, periódicos y libros.</w:t>
+            </w:r>
+          </w:p>
+        </w:tc>
+        <w:tc>
+          <w:tcPr>
+            <w:tcW w:type="dxa" w:w="4535"/>
+          </w:tcPr>
+          <w:p>
+            <w:pPr>
+              <w:spacing w:after="0"/>
+            </w:pPr>
+            <w:r/>
+            <w:r>
+              <w:rPr>
+                <w:b w:val="0"/>
+              </w:rPr>
+              <w:t>—</w:t>
+            </w:r>
+          </w:p>
+        </w:tc>
+      </w:tr>
+      <w:tr>
+        <w:tc>
+          <w:tcPr>
+            <w:tcW w:type="dxa" w:w="1134"/>
+            <w:shd w:val="clear" w:fill="F2F2F2"/>
+          </w:tcPr>
+          <w:p>
+            <w:pPr>
+              <w:spacing w:after="0"/>
+            </w:pPr>
+            <w:r/>
+            <w:r>
+              <w:rPr>
+                <w:b/>
+              </w:rPr>
+              <w:t>QL</w:t>
+            </w:r>
+          </w:p>
+        </w:tc>
+        <w:tc>
+          <w:tcPr>
+            <w:tcW w:type="dxa" w:w="3515"/>
+          </w:tcPr>
+          <w:p>
+            <w:pPr>
+              <w:spacing w:after="0"/>
+            </w:pPr>
+            <w:r/>
+            <w:r>
+              <w:rPr>
+                <w:b w:val="0"/>
+              </w:rPr>
+              <w:t>12 % servicios. NO USAR.</w:t>
             </w:r>
           </w:p>
         </w:tc>
@@ -576,7 +658,78 @@
               <w:rPr>
                 <w:b w:val="0"/>
               </w:rPr>
-              <w:t>Sin detalle en el manual.</w:t>
+              <w:t>Ver Q7.</w:t>
+            </w:r>
+          </w:p>
+        </w:tc>
+      </w:tr>
+      <w:tr>
+        <w:tc>
+          <w:tcPr>
+            <w:tcW w:type="dxa" w:w="1134"/>
+            <w:shd w:val="clear" w:fill="F2F2F2"/>
+          </w:tcPr>
+          <w:p>
+            <w:pPr>
+              <w:spacing w:after="0"/>
+            </w:pPr>
+            <w:r/>
+            <w:r>
+              <w:rPr>
+                <w:b/>
+              </w:rPr>
+              <w:t>Q7</w:t>
+            </w:r>
+          </w:p>
+        </w:tc>
+        <w:tc>
+          <w:tcPr>
+            <w:tcW w:type="dxa" w:w="3515"/>
+          </w:tcPr>
+          <w:p>
+            <w:pPr>
+              <w:spacing w:after="0"/>
+            </w:pPr>
+            <w:r/>
+            <w:r>
+              <w:rPr>
+                <w:b w:val="0"/>
+              </w:rPr>
+              <w:t>12 % bienes. NO USAR.</w:t>
+            </w:r>
+          </w:p>
+        </w:tc>
+        <w:tc>
+          <w:tcPr>
+            <w:tcW w:type="dxa" w:w="5783"/>
+          </w:tcPr>
+          <w:p>
+            <w:pPr>
+              <w:spacing w:after="0"/>
+            </w:pPr>
+            <w:r/>
+            <w:r>
+              <w:rPr>
+                <w:b w:val="0"/>
+              </w:rPr>
+              <w:t>12 % nunca es deducible (típico restaurante/catering con clientes).</w:t>
+            </w:r>
+          </w:p>
+        </w:tc>
+        <w:tc>
+          <w:tcPr>
+            <w:tcW w:type="dxa" w:w="4535"/>
+          </w:tcPr>
+          <w:p>
+            <w:pPr>
+              <w:spacing w:after="0"/>
+            </w:pPr>
+            <w:r/>
+            <w:r>
+              <w:rPr>
+                <w:b w:val="0"/>
+              </w:rPr>
+              <w:t>Ver Q0 para gastos no deducibles. (Pendiente confirmar con SSC.)</w:t>
             </w:r>
           </w:p>
         </w:tc>
@@ -738,230 +891,6 @@
               <w:rPr>
                 <w:b/>
               </w:rPr>
-              <w:t>QK</w:t>
-            </w:r>
-          </w:p>
-        </w:tc>
-        <w:tc>
-          <w:tcPr>
-            <w:tcW w:type="dxa" w:w="3515"/>
-          </w:tcPr>
-          <w:p>
-            <w:pPr>
-              <w:spacing w:after="0"/>
-            </w:pPr>
-            <w:r/>
-            <w:r>
-              <w:rPr>
-                <w:b w:val="0"/>
-              </w:rPr>
-              <w:t>21 % servicios y bienes diversos.</w:t>
-            </w:r>
-          </w:p>
-        </w:tc>
-        <w:tc>
-          <w:tcPr>
-            <w:tcW w:type="dxa" w:w="5783"/>
-          </w:tcPr>
-          <w:p>
-            <w:pPr>
-              <w:spacing w:after="0"/>
-            </w:pPr>
-            <w:r/>
-            <w:r>
-              <w:rPr>
-                <w:b w:val="0"/>
-              </w:rPr>
-              <w:t>Proveedor BE con 21 % de servicios o bienes diversos. PO Coupa 3000…: siempre QK.</w:t>
-            </w:r>
-          </w:p>
-        </w:tc>
-        <w:tc>
-          <w:tcPr>
-            <w:tcW w:type="dxa" w:w="4535"/>
-          </w:tcPr>
-          <w:p>
-            <w:pPr>
-              <w:spacing w:after="0"/>
-            </w:pPr>
-            <w:r/>
-            <w:r>
-              <w:rPr>
-                <w:b w:val="0"/>
-              </w:rPr>
-              <w:t>Único código de 21 % en DSSPM.</w:t>
-            </w:r>
-          </w:p>
-          <w:p>
-            <w:pPr>
-              <w:spacing w:after="0"/>
-            </w:pPr>
-            <w:r>
-              <w:rPr>
-                <w:b w:val="0"/>
-              </w:rPr>
-              <w:t>Si la PO es 45… manda la SAP Tax Table.</w:t>
-            </w:r>
-          </w:p>
-        </w:tc>
-      </w:tr>
-      <w:tr>
-        <w:tc>
-          <w:tcPr>
-            <w:tcW w:type="dxa" w:w="1134"/>
-            <w:shd w:val="clear" w:fill="F2F2F2"/>
-          </w:tcPr>
-          <w:p>
-            <w:pPr>
-              <w:spacing w:after="0"/>
-            </w:pPr>
-            <w:r/>
-            <w:r>
-              <w:rPr>
-                <w:b/>
-              </w:rPr>
-              <w:t>QL</w:t>
-            </w:r>
-          </w:p>
-        </w:tc>
-        <w:tc>
-          <w:tcPr>
-            <w:tcW w:type="dxa" w:w="3515"/>
-          </w:tcPr>
-          <w:p>
-            <w:pPr>
-              <w:spacing w:after="0"/>
-            </w:pPr>
-            <w:r/>
-            <w:r>
-              <w:rPr>
-                <w:b w:val="0"/>
-              </w:rPr>
-              <w:t>12 % servicios. NO USAR.</w:t>
-            </w:r>
-          </w:p>
-        </w:tc>
-        <w:tc>
-          <w:tcPr>
-            <w:tcW w:type="dxa" w:w="5783"/>
-          </w:tcPr>
-          <w:p>
-            <w:pPr>
-              <w:spacing w:after="0"/>
-            </w:pPr>
-            <w:r/>
-            <w:r>
-              <w:rPr>
-                <w:b w:val="0"/>
-              </w:rPr>
-              <w:t>—</w:t>
-            </w:r>
-          </w:p>
-        </w:tc>
-        <w:tc>
-          <w:tcPr>
-            <w:tcW w:type="dxa" w:w="4535"/>
-          </w:tcPr>
-          <w:p>
-            <w:pPr>
-              <w:spacing w:after="0"/>
-            </w:pPr>
-            <w:r/>
-            <w:r>
-              <w:rPr>
-                <w:b w:val="0"/>
-              </w:rPr>
-              <w:t>Ver Q7.</w:t>
-            </w:r>
-          </w:p>
-        </w:tc>
-      </w:tr>
-      <w:tr>
-        <w:tc>
-          <w:tcPr>
-            <w:tcW w:type="dxa" w:w="1134"/>
-            <w:shd w:val="clear" w:fill="F2F2F2"/>
-          </w:tcPr>
-          <w:p>
-            <w:pPr>
-              <w:spacing w:after="0"/>
-            </w:pPr>
-            <w:r/>
-            <w:r>
-              <w:rPr>
-                <w:b/>
-              </w:rPr>
-              <w:t>QM</w:t>
-            </w:r>
-          </w:p>
-        </w:tc>
-        <w:tc>
-          <w:tcPr>
-            <w:tcW w:type="dxa" w:w="3515"/>
-          </w:tcPr>
-          <w:p>
-            <w:pPr>
-              <w:spacing w:after="0"/>
-            </w:pPr>
-            <w:r/>
-            <w:r>
-              <w:rPr>
-                <w:b w:val="0"/>
-              </w:rPr>
-              <w:t>6 % servicios y bienes diversos.</w:t>
-            </w:r>
-          </w:p>
-        </w:tc>
-        <w:tc>
-          <w:tcPr>
-            <w:tcW w:type="dxa" w:w="5783"/>
-          </w:tcPr>
-          <w:p>
-            <w:pPr>
-              <w:spacing w:after="0"/>
-            </w:pPr>
-            <w:r/>
-            <w:r>
-              <w:rPr>
-                <w:b w:val="0"/>
-              </w:rPr>
-              <w:t>Agua de red (De Watergroep 1000016615, TMVW 1000016594), taxi, agua potable/refrescos/fruta, medicamentos, periódicos y libros.</w:t>
-            </w:r>
-          </w:p>
-        </w:tc>
-        <w:tc>
-          <w:tcPr>
-            <w:tcW w:type="dxa" w:w="4535"/>
-          </w:tcPr>
-          <w:p>
-            <w:pPr>
-              <w:spacing w:after="0"/>
-            </w:pPr>
-            <w:r/>
-            <w:r>
-              <w:rPr>
-                <w:b w:val="0"/>
-              </w:rPr>
-              <w:t>—</w:t>
-            </w:r>
-          </w:p>
-        </w:tc>
-      </w:tr>
-      <w:tr>
-        <w:tc>
-          <w:tcPr>
-            <w:tcW w:type="dxa" w:w="1134"/>
-            <w:shd w:val="clear" w:fill="F2F2F2"/>
-          </w:tcPr>
-          <w:p>
-            <w:pPr>
-              <w:spacing w:after="0"/>
-            </w:pPr>
-            <w:r/>
-            <w:r>
-              <w:rPr>
-                <w:b/>
-              </w:rPr>
               <w:t>QN</w:t>
             </w:r>
           </w:p>
@@ -1014,6 +943,77 @@
                 <w:b w:val="0"/>
               </w:rPr>
               <w:t>No confundir con servicios intracomunitarios (Q5): aquí el proveedor es belga con NIF-IVA BE.</w:t>
+            </w:r>
+          </w:p>
+        </w:tc>
+      </w:tr>
+      <w:tr>
+        <w:tc>
+          <w:tcPr>
+            <w:tcW w:type="dxa" w:w="1134"/>
+            <w:shd w:val="clear" w:fill="F2F2F2"/>
+          </w:tcPr>
+          <w:p>
+            <w:pPr>
+              <w:spacing w:after="0"/>
+            </w:pPr>
+            <w:r/>
+            <w:r>
+              <w:rPr>
+                <w:b/>
+              </w:rPr>
+              <w:t>QA</w:t>
+            </w:r>
+          </w:p>
+        </w:tc>
+        <w:tc>
+          <w:tcPr>
+            <w:tcW w:type="dxa" w:w="3515"/>
+          </w:tcPr>
+          <w:p>
+            <w:pPr>
+              <w:spacing w:after="0"/>
+            </w:pPr>
+            <w:r/>
+            <w:r>
+              <w:rPr>
+                <w:b w:val="0"/>
+              </w:rPr>
+              <w:t>Sin %: regalos / uso privado (sin deducción).</w:t>
+            </w:r>
+          </w:p>
+        </w:tc>
+        <w:tc>
+          <w:tcPr>
+            <w:tcW w:type="dxa" w:w="5783"/>
+          </w:tcPr>
+          <w:p>
+            <w:pPr>
+              <w:spacing w:after="0"/>
+            </w:pPr>
+            <w:r/>
+            <w:r>
+              <w:rPr>
+                <w:b w:val="0"/>
+              </w:rPr>
+              <w:t>—</w:t>
+            </w:r>
+          </w:p>
+        </w:tc>
+        <w:tc>
+          <w:tcPr>
+            <w:tcW w:type="dxa" w:w="4535"/>
+          </w:tcPr>
+          <w:p>
+            <w:pPr>
+              <w:spacing w:after="0"/>
+            </w:pPr>
+            <w:r/>
+            <w:r>
+              <w:rPr>
+                <w:b w:val="0"/>
+              </w:rPr>
+              <w:t>Sin detalle en el manual.</w:t>
             </w:r>
           </w:p>
         </w:tc>
@@ -1230,6 +1230,77 @@
               <w:rPr>
                 <w:b/>
               </w:rPr>
+              <w:t>Q9</w:t>
+            </w:r>
+          </w:p>
+        </w:tc>
+        <w:tc>
+          <w:tcPr>
+            <w:tcW w:type="dxa" w:w="3515"/>
+          </w:tcPr>
+          <w:p>
+            <w:pPr>
+              <w:spacing w:after="0"/>
+            </w:pPr>
+            <w:r/>
+            <w:r>
+              <w:rPr>
+                <w:b w:val="0"/>
+              </w:rPr>
+              <w:t>0 % bienes: autoliquidación local (proveedor no establecido en BE).</w:t>
+            </w:r>
+          </w:p>
+        </w:tc>
+        <w:tc>
+          <w:tcPr>
+            <w:tcW w:type="dxa" w:w="5783"/>
+          </w:tcPr>
+          <w:p>
+            <w:pPr>
+              <w:spacing w:after="0"/>
+            </w:pPr>
+            <w:r/>
+            <w:r>
+              <w:rPr>
+                <w:b w:val="0"/>
+              </w:rPr>
+              <w:t>Solo DS Smith Packaging Netherlands BV (1000002308), compra de papel (DS Smith Paper Sourcing). Tiene NIF-IVA belga pero está establecido en NL; no factura IVA BE. Art. 194 Directiva IVA.</w:t>
+            </w:r>
+          </w:p>
+        </w:tc>
+        <w:tc>
+          <w:tcPr>
+            <w:tcW w:type="dxa" w:w="4535"/>
+          </w:tcPr>
+          <w:p>
+            <w:pPr>
+              <w:spacing w:after="0"/>
+            </w:pPr>
+            <w:r/>
+            <w:r>
+              <w:rPr>
+                <w:b w:val="0"/>
+              </w:rPr>
+              <w:t>Verify y el cockpit lo asignan automáticamente. Todas sus facturas, incluidos rebates.</w:t>
+            </w:r>
+          </w:p>
+        </w:tc>
+      </w:tr>
+      <w:tr>
+        <w:tc>
+          <w:tcPr>
+            <w:tcW w:type="dxa" w:w="1134"/>
+            <w:shd w:val="clear" w:fill="F2F2F2"/>
+          </w:tcPr>
+          <w:p>
+            <w:pPr>
+              <w:spacing w:after="0"/>
+            </w:pPr>
+            <w:r/>
+            <w:r>
+              <w:rPr>
+                <w:b/>
+              </w:rPr>
               <w:t>QN</w:t>
             </w:r>
           </w:p>
@@ -1282,77 +1353,6 @@
                 <w:b w:val="0"/>
               </w:rPr>
               <w:t>No confundir con Q5; el proveedor no siempre cita el artículo: revisar si hay instalación.</w:t>
-            </w:r>
-          </w:p>
-        </w:tc>
-      </w:tr>
-      <w:tr>
-        <w:tc>
-          <w:tcPr>
-            <w:tcW w:type="dxa" w:w="1134"/>
-            <w:shd w:val="clear" w:fill="F2F2F2"/>
-          </w:tcPr>
-          <w:p>
-            <w:pPr>
-              <w:spacing w:after="0"/>
-            </w:pPr>
-            <w:r/>
-            <w:r>
-              <w:rPr>
-                <w:b/>
-              </w:rPr>
-              <w:t>Q9</w:t>
-            </w:r>
-          </w:p>
-        </w:tc>
-        <w:tc>
-          <w:tcPr>
-            <w:tcW w:type="dxa" w:w="3515"/>
-          </w:tcPr>
-          <w:p>
-            <w:pPr>
-              <w:spacing w:after="0"/>
-            </w:pPr>
-            <w:r/>
-            <w:r>
-              <w:rPr>
-                <w:b w:val="0"/>
-              </w:rPr>
-              <w:t>0 % bienes: autoliquidación local (proveedor no establecido en BE).</w:t>
-            </w:r>
-          </w:p>
-        </w:tc>
-        <w:tc>
-          <w:tcPr>
-            <w:tcW w:type="dxa" w:w="5783"/>
-          </w:tcPr>
-          <w:p>
-            <w:pPr>
-              <w:spacing w:after="0"/>
-            </w:pPr>
-            <w:r/>
-            <w:r>
-              <w:rPr>
-                <w:b w:val="0"/>
-              </w:rPr>
-              <w:t>Solo DS Smith Packaging Netherlands BV (1000002308), compra de papel (DS Smith Paper Sourcing). Tiene NIF-IVA belga pero está establecido en NL; no factura IVA BE. Art. 194 Directiva IVA.</w:t>
-            </w:r>
-          </w:p>
-        </w:tc>
-        <w:tc>
-          <w:tcPr>
-            <w:tcW w:type="dxa" w:w="4535"/>
-          </w:tcPr>
-          <w:p>
-            <w:pPr>
-              <w:spacing w:after="0"/>
-            </w:pPr>
-            <w:r/>
-            <w:r>
-              <w:rPr>
-                <w:b w:val="0"/>
-              </w:rPr>
-              <w:t>Verify y el cockpit lo asignan automáticamente. Todas sus facturas, incluidos rebates.</w:t>
             </w:r>
           </w:p>
         </w:tc>

</xml_diff>